<commit_message>
refactor FAERS processing instructions for improved clarity and formatting
</commit_message>
<xml_diff>
--- a/documentation/FAERS_Processing_Instructions.docx
+++ b/documentation/FAERS_Processing_Instructions.docx
@@ -1,7 +1,122 @@
 
 <file path=word/document.xml><?xml version="1.0" encoding="utf-8"?>
-<w:document xmlns:wpc="http://schemas.microsoft.com/office/word/2010/wordprocessingCanvas" xmlns:mo="http://schemas.microsoft.com/office/mac/office/2008/main" xmlns:mc="http://schemas.openxmlformats.org/markup-compatibility/2006" xmlns:mv="urn:schemas-microsoft-com:mac:vml" xmlns:o="urn:schemas-microsoft-com:office:office" xmlns:r="http://schemas.openxmlformats.org/officeDocument/2006/relationships" xmlns:m="http://schemas.openxmlformats.org/officeDocument/2006/math" xmlns:v="urn:schemas-microsoft-com:vml" xmlns:wp14="http://schemas.microsoft.com/office/word/2010/wordprocessingDrawing" xmlns:wp="http://schemas.openxmlformats.org/drawingml/2006/wordprocessingDrawing" xmlns:w10="urn:schemas-microsoft-com:office:word" xmlns:w="http://schemas.openxmlformats.org/wordprocessingml/2006/main" xmlns:w14="http://schemas.microsoft.com/office/word/2010/wordml" xmlns:w15="http://schemas.microsoft.com/office/word/2012/wordml" xmlns:wpg="http://schemas.microsoft.com/office/word/2010/wordprocessingGroup" xmlns:wpi="http://schemas.microsoft.com/office/word/2010/wordprocessingInk" xmlns:wne="http://schemas.microsoft.com/office/word/2006/wordml" xmlns:wps="http://schemas.microsoft.com/office/word/2010/wordprocessingShape" mc:Ignorable="w14 w15 wp14">
+<w:document xmlns:wpc="http://schemas.microsoft.com/office/word/2010/wordprocessingCanvas" xmlns:cx="http://schemas.microsoft.com/office/drawing/2014/chartex" xmlns:cx1="http://schemas.microsoft.com/office/drawing/2015/9/8/chartex" xmlns:cx2="http://schemas.microsoft.com/office/drawing/2015/10/21/chartex" xmlns:cx3="http://schemas.microsoft.com/office/drawing/2016/5/9/chartex" xmlns:cx4="http://schemas.microsoft.com/office/drawing/2016/5/10/chartex" xmlns:cx5="http://schemas.microsoft.com/office/drawing/2016/5/11/chartex" xmlns:cx6="http://schemas.microsoft.com/office/drawing/2016/5/12/chartex" xmlns:cx7="http://schemas.microsoft.com/office/drawing/2016/5/13/chartex" xmlns:cx8="http://schemas.microsoft.com/office/drawing/2016/5/14/chartex" xmlns:mc="http://schemas.openxmlformats.org/markup-compatibility/2006" xmlns:aink="http://schemas.microsoft.com/office/drawing/2016/ink" xmlns:am3d="http://schemas.microsoft.com/office/drawing/2017/model3d" xmlns:o="urn:schemas-microsoft-com:office:office" xmlns:oel="http://schemas.microsoft.com/office/2019/extlst" xmlns:r="http://schemas.openxmlformats.org/officeDocument/2006/relationships" xmlns:m="http://schemas.openxmlformats.org/officeDocument/2006/math" xmlns:v="urn:schemas-microsoft-com:vml" xmlns:wp14="http://schemas.microsoft.com/office/word/2010/wordprocessingDrawing" xmlns:wp="http://schemas.openxmlformats.org/drawingml/2006/wordprocessingDrawing" xmlns:w10="urn:schemas-microsoft-com:office:word" xmlns:w="http://schemas.openxmlformats.org/wordprocessingml/2006/main" xmlns:w14="http://schemas.microsoft.com/office/word/2010/wordml" xmlns:w15="http://schemas.microsoft.com/office/word/2012/wordml" xmlns:w16cex="http://schemas.microsoft.com/office/word/2018/wordml/cex" xmlns:w16cid="http://schemas.microsoft.com/office/word/2016/wordml/cid" xmlns:w16="http://schemas.microsoft.com/office/word/2018/wordml" xmlns:w16du="http://schemas.microsoft.com/office/word/2023/wordml/word16du" xmlns:w16sdtdh="http://schemas.microsoft.com/office/word/2020/wordml/sdtdatahash" xmlns:w16sdtfl="http://schemas.microsoft.com/office/word/2024/wordml/sdtformatlock" xmlns:w16se="http://schemas.microsoft.com/office/word/2015/wordml/symex" xmlns:wpg="http://schemas.microsoft.com/office/word/2010/wordprocessingGroup" xmlns:wpi="http://schemas.microsoft.com/office/word/2010/wordprocessingInk" xmlns:wne="http://schemas.microsoft.com/office/word/2006/wordml" xmlns:wps="http://schemas.microsoft.com/office/word/2010/wordprocessingShape" mc:Ignorable="w14 w15 w16se w16cid w16 w16cex w16sdtdh w16sdtfl w16du wp14">
   <w:body>
+    <w:p>
+      <w:pPr>
+        <w:pStyle w:val="ListParagraph"/>
+        <w:numPr>
+          <w:ilvl w:val="0"/>
+          <w:numId w:val="1"/>
+        </w:numPr>
+      </w:pPr>
+      <w:r>
+        <w:rPr>
+          <w:sz w:val="44"/>
+          <w:szCs w:val="44"/>
+          <w:highlight w:val="red"/>
+        </w:rPr>
+        <w:t>□</w:t>
+      </w:r>
+      <w:r>
+        <w:t xml:space="preserve">  = </w:t>
+      </w:r>
+      <w:r>
+        <w:t>stage 1</w:t>
+      </w:r>
+    </w:p>
+    <w:p>
+      <w:pPr>
+        <w:pStyle w:val="ListParagraph"/>
+        <w:numPr>
+          <w:ilvl w:val="0"/>
+          <w:numId w:val="1"/>
+        </w:numPr>
+      </w:pPr>
+      <w:r>
+        <w:rPr>
+          <w:sz w:val="44"/>
+          <w:szCs w:val="44"/>
+          <w:highlight w:val="yellow"/>
+        </w:rPr>
+        <w:t>□</w:t>
+      </w:r>
+      <w:r>
+        <w:t xml:space="preserve">  = </w:t>
+      </w:r>
+      <w:r>
+        <w:t>stage 2</w:t>
+      </w:r>
+    </w:p>
+    <w:p>
+      <w:pPr>
+        <w:pStyle w:val="ListParagraph"/>
+        <w:numPr>
+          <w:ilvl w:val="0"/>
+          <w:numId w:val="1"/>
+        </w:numPr>
+      </w:pPr>
+      <w:r>
+        <w:rPr>
+          <w:sz w:val="44"/>
+          <w:szCs w:val="44"/>
+          <w:highlight w:val="green"/>
+        </w:rPr>
+        <w:t>□</w:t>
+      </w:r>
+      <w:r>
+        <w:t xml:space="preserve">  = </w:t>
+      </w:r>
+      <w:r>
+        <w:t>stage 3</w:t>
+      </w:r>
+    </w:p>
+    <w:p>
+      <w:pPr>
+        <w:pStyle w:val="ListParagraph"/>
+        <w:numPr>
+          <w:ilvl w:val="0"/>
+          <w:numId w:val="1"/>
+        </w:numPr>
+      </w:pPr>
+      <w:r>
+        <w:rPr>
+          <w:sz w:val="44"/>
+          <w:szCs w:val="44"/>
+          <w:highlight w:val="cyan"/>
+        </w:rPr>
+        <w:t>□</w:t>
+      </w:r>
+      <w:r>
+        <w:t xml:space="preserve">  = </w:t>
+      </w:r>
+      <w:r>
+        <w:t>stage 4</w:t>
+      </w:r>
+    </w:p>
+    <w:p>
+      <w:pPr>
+        <w:pStyle w:val="ListParagraph"/>
+        <w:numPr>
+          <w:ilvl w:val="0"/>
+          <w:numId w:val="1"/>
+        </w:numPr>
+      </w:pPr>
+      <w:r>
+        <w:rPr>
+          <w:sz w:val="44"/>
+          <w:szCs w:val="44"/>
+          <w:highlight w:val="magenta"/>
+        </w:rPr>
+        <w:t>□</w:t>
+      </w:r>
+      <w:r>
+        <w:t xml:space="preserve">  = </w:t>
+      </w:r>
+      <w:r>
+        <w:t>stage 5</w:t>
+      </w:r>
+    </w:p>
     <w:p>
       <w:pPr>
         <w:pStyle w:val="Heading11"/>
@@ -19,6 +134,11 @@
     <w:p>
       <w:r>
         <w:t>LTS Computing LLC</w:t>
+      </w:r>
+    </w:p>
+    <w:p>
+      <w:r>
+        <w:t xml:space="preserve">  = </w:t>
       </w:r>
     </w:p>
     <w:p>
@@ -37,14 +157,12 @@
         <w:t xml:space="preserve">The source code (shell scripts and SQL scripts) developed by LTS Computing LLC to execute this process is available as open source under the Apache 2.0 license on </w:t>
       </w:r>
       <w:hyperlink r:id="rId7">
-        <w:proofErr w:type="spellStart"/>
         <w:r>
           <w:rPr>
             <w:rStyle w:val="InternetLink"/>
           </w:rPr>
           <w:t>github</w:t>
         </w:r>
-        <w:proofErr w:type="spellEnd"/>
       </w:hyperlink>
     </w:p>
     <w:p>
@@ -121,13 +239,8 @@
           <w:tab w:val="left" w:pos="425"/>
         </w:tabs>
       </w:pPr>
-      <w:proofErr w:type="spellStart"/>
-      <w:r>
-        <w:t>Pgadmin</w:t>
-      </w:r>
-      <w:proofErr w:type="spellEnd"/>
-      <w:r>
-        <w:t xml:space="preserve"> III PostgreSQL SQL client. Use this client to run the SQL scripts.</w:t>
+      <w:r>
+        <w:t>Pgadmin III PostgreSQL SQL client. Use this client to run the SQL scripts.</w:t>
       </w:r>
     </w:p>
     <w:p>
@@ -167,15 +280,7 @@
         </w:tabs>
       </w:pPr>
       <w:r>
-        <w:t>Load the FDA Orange book file. NDA reference data file into a PostgreSQL table called “</w:t>
-      </w:r>
-      <w:proofErr w:type="spellStart"/>
-      <w:r>
-        <w:t>nda</w:t>
-      </w:r>
-      <w:proofErr w:type="spellEnd"/>
-      <w:r>
-        <w:t>” to look-up ingredients by NDA number</w:t>
+        <w:t>Load the FDA Orange book file. NDA reference data file into a PostgreSQL table called “nda” to look-up ingredients by NDA number</w:t>
       </w:r>
     </w:p>
     <w:p>
@@ -224,11 +329,9 @@
           <w:tab w:val="left" w:pos="425"/>
         </w:tabs>
       </w:pPr>
-      <w:proofErr w:type="spellStart"/>
       <w:r>
         <w:t>load_nda_table.sql</w:t>
       </w:r>
-      <w:proofErr w:type="spellEnd"/>
     </w:p>
     <w:p>
       <w:pPr>
@@ -241,15 +344,7 @@
         </w:tabs>
       </w:pPr>
       <w:r>
-        <w:t xml:space="preserve">Load the </w:t>
-      </w:r>
-      <w:proofErr w:type="spellStart"/>
-      <w:r>
-        <w:t>country_codes</w:t>
-      </w:r>
-      <w:proofErr w:type="spellEnd"/>
-      <w:r>
-        <w:t xml:space="preserve"> reference table by running the script:</w:t>
+        <w:t>Load the country_codes reference table by running the script:</w:t>
       </w:r>
     </w:p>
     <w:p>
@@ -262,11 +357,9 @@
           <w:tab w:val="left" w:pos="425"/>
         </w:tabs>
       </w:pPr>
-      <w:proofErr w:type="spellStart"/>
       <w:r>
         <w:t>load_country_code_table.sql</w:t>
       </w:r>
-      <w:proofErr w:type="spellEnd"/>
     </w:p>
     <w:p>
       <w:pPr>
@@ -292,11 +385,9 @@
           <w:tab w:val="left" w:pos="425"/>
         </w:tabs>
       </w:pPr>
-      <w:proofErr w:type="spellStart"/>
       <w:r>
         <w:t>load_eu_drug_name_active_ingredient.sql</w:t>
       </w:r>
-      <w:proofErr w:type="spellEnd"/>
     </w:p>
     <w:p>
       <w:pPr>
@@ -337,23 +428,7 @@
         <w:t xml:space="preserve">  </w:t>
       </w:r>
       <w:r>
-        <w:t xml:space="preserve">On the Athena website vocabulary download page keep the pre-selected vocabularies and also select the </w:t>
-      </w:r>
-      <w:proofErr w:type="spellStart"/>
-      <w:r>
-        <w:t>MedDRA</w:t>
-      </w:r>
-      <w:proofErr w:type="spellEnd"/>
-      <w:r>
-        <w:t xml:space="preserve"> vocabulary (review the EULA link for </w:t>
-      </w:r>
-      <w:proofErr w:type="spellStart"/>
-      <w:r>
-        <w:t>MedDRA</w:t>
-      </w:r>
-      <w:proofErr w:type="spellEnd"/>
-      <w:r>
-        <w:t>).</w:t>
+        <w:t>On the Athena website vocabulary download page keep the pre-selected vocabularies and also select the MedDRA vocabulary (review the EULA link for MedDRA).</w:t>
       </w:r>
     </w:p>
     <w:p>
@@ -367,23 +442,7 @@
         </w:tabs>
       </w:pPr>
       <w:r>
-        <w:t xml:space="preserve">Create the </w:t>
-      </w:r>
-      <w:proofErr w:type="spellStart"/>
-      <w:r>
-        <w:t>meddra</w:t>
-      </w:r>
-      <w:proofErr w:type="spellEnd"/>
-      <w:r>
-        <w:t xml:space="preserve"> / </w:t>
-      </w:r>
-      <w:proofErr w:type="spellStart"/>
-      <w:r>
-        <w:t>snomed</w:t>
-      </w:r>
-      <w:proofErr w:type="spellEnd"/>
-      <w:r>
-        <w:t xml:space="preserve"> mapping table by running the script:</w:t>
+        <w:t>Create the meddra / snomed mapping table by running the script:</w:t>
       </w:r>
     </w:p>
     <w:p>
@@ -396,14 +455,13 @@
           <w:tab w:val="left" w:pos="425"/>
         </w:tabs>
       </w:pPr>
-      <w:proofErr w:type="spellStart"/>
-      <w:r>
+      <w:r>
+        <w:lastRenderedPageBreak/>
         <w:t>c</w:t>
       </w:r>
       <w:r>
         <w:t>reate_meddra_snomed_mapping_table.sql</w:t>
       </w:r>
-      <w:proofErr w:type="spellEnd"/>
     </w:p>
     <w:p/>
     <w:p>
@@ -468,7 +526,6 @@
         </w:numPr>
       </w:pPr>
       <w:r>
-        <w:lastRenderedPageBreak/>
         <w:t>Combine the current data individual files into combined files to load</w:t>
       </w:r>
     </w:p>
@@ -647,11 +704,9 @@
           <w:numId w:val="6"/>
         </w:numPr>
       </w:pPr>
-      <w:proofErr w:type="spellStart"/>
       <w:r>
         <w:t>load_current_demo_table.sql</w:t>
       </w:r>
-      <w:proofErr w:type="spellEnd"/>
     </w:p>
     <w:p>
       <w:pPr>
@@ -660,11 +715,9 @@
           <w:numId w:val="6"/>
         </w:numPr>
       </w:pPr>
-      <w:proofErr w:type="spellStart"/>
       <w:r>
         <w:t>load_current_drug_table.sql</w:t>
       </w:r>
-      <w:proofErr w:type="spellEnd"/>
     </w:p>
     <w:p>
       <w:pPr>
@@ -673,11 +726,9 @@
           <w:numId w:val="6"/>
         </w:numPr>
       </w:pPr>
-      <w:proofErr w:type="spellStart"/>
       <w:r>
         <w:t>load_current_indi_table.sql</w:t>
       </w:r>
-      <w:proofErr w:type="spellEnd"/>
     </w:p>
     <w:p>
       <w:pPr>
@@ -686,11 +737,9 @@
           <w:numId w:val="6"/>
         </w:numPr>
       </w:pPr>
-      <w:proofErr w:type="spellStart"/>
       <w:r>
         <w:t>load_current_outc_table.sql</w:t>
       </w:r>
-      <w:proofErr w:type="spellEnd"/>
     </w:p>
     <w:p>
       <w:pPr>
@@ -699,11 +748,9 @@
           <w:numId w:val="6"/>
         </w:numPr>
       </w:pPr>
-      <w:proofErr w:type="spellStart"/>
       <w:r>
         <w:t>load_current_reac_table.sql</w:t>
       </w:r>
-      <w:proofErr w:type="spellEnd"/>
     </w:p>
     <w:p>
       <w:pPr>
@@ -712,11 +759,9 @@
           <w:numId w:val="6"/>
         </w:numPr>
       </w:pPr>
-      <w:proofErr w:type="spellStart"/>
       <w:r>
         <w:t>load_current_rpsr_table.sql</w:t>
       </w:r>
-      <w:proofErr w:type="spellEnd"/>
     </w:p>
     <w:p>
       <w:pPr>
@@ -725,11 +770,9 @@
           <w:numId w:val="6"/>
         </w:numPr>
       </w:pPr>
-      <w:proofErr w:type="spellStart"/>
       <w:r>
         <w:t>load_current_ther_table.sql</w:t>
       </w:r>
-      <w:proofErr w:type="spellEnd"/>
     </w:p>
     <w:p>
       <w:pPr>
@@ -863,6 +906,7 @@
         </w:tabs>
       </w:pPr>
       <w:r>
+        <w:lastRenderedPageBreak/>
         <w:t>c</w:t>
       </w:r>
       <w:r>
@@ -978,12 +1022,9 @@
           <w:numId w:val="6"/>
         </w:numPr>
       </w:pPr>
-      <w:proofErr w:type="spellStart"/>
-      <w:r>
-        <w:lastRenderedPageBreak/>
+      <w:r>
         <w:t>load_legacy_demo_table.sql</w:t>
       </w:r>
-      <w:proofErr w:type="spellEnd"/>
     </w:p>
     <w:p>
       <w:pPr>
@@ -992,11 +1033,9 @@
           <w:numId w:val="6"/>
         </w:numPr>
       </w:pPr>
-      <w:proofErr w:type="spellStart"/>
       <w:r>
         <w:t>load_legacy_drug_table.sql</w:t>
       </w:r>
-      <w:proofErr w:type="spellEnd"/>
     </w:p>
     <w:p>
       <w:pPr>
@@ -1005,11 +1044,9 @@
           <w:numId w:val="6"/>
         </w:numPr>
       </w:pPr>
-      <w:proofErr w:type="spellStart"/>
       <w:r>
         <w:t>load_legacy_indi_table.sql</w:t>
       </w:r>
-      <w:proofErr w:type="spellEnd"/>
     </w:p>
     <w:p>
       <w:pPr>
@@ -1018,11 +1055,9 @@
           <w:numId w:val="6"/>
         </w:numPr>
       </w:pPr>
-      <w:proofErr w:type="spellStart"/>
       <w:r>
         <w:t>load_legacy_outc_table.sql</w:t>
       </w:r>
-      <w:proofErr w:type="spellEnd"/>
     </w:p>
     <w:p>
       <w:pPr>
@@ -1031,11 +1066,9 @@
           <w:numId w:val="6"/>
         </w:numPr>
       </w:pPr>
-      <w:proofErr w:type="spellStart"/>
       <w:r>
         <w:t>load_legacy_reac_table.sql</w:t>
       </w:r>
-      <w:proofErr w:type="spellEnd"/>
     </w:p>
     <w:p>
       <w:pPr>
@@ -1044,11 +1077,9 @@
           <w:numId w:val="6"/>
         </w:numPr>
       </w:pPr>
-      <w:proofErr w:type="spellStart"/>
       <w:r>
         <w:t>load_legacy_rpsr_table.sql</w:t>
       </w:r>
-      <w:proofErr w:type="spellEnd"/>
     </w:p>
     <w:p>
       <w:pPr>
@@ -1057,11 +1088,9 @@
           <w:numId w:val="6"/>
         </w:numPr>
       </w:pPr>
-      <w:proofErr w:type="spellStart"/>
       <w:r>
         <w:t>load_legacy_ther_table.sql</w:t>
       </w:r>
-      <w:proofErr w:type="spellEnd"/>
     </w:p>
     <w:p>
       <w:pPr>
@@ -1112,79 +1141,90 @@
           <w:tab w:val="left" w:pos="425"/>
         </w:tabs>
         <w:ind w:left="420" w:hanging="420"/>
-      </w:pPr>
-      <w:r>
+        <w:rPr>
+          <w:strike/>
+        </w:rPr>
+      </w:pPr>
+      <w:r>
+        <w:rPr>
+          <w:strike/>
+        </w:rPr>
         <w:t xml:space="preserve">Run the </w:t>
       </w:r>
-      <w:proofErr w:type="spellStart"/>
       <w:r>
         <w:rPr>
           <w:b/>
           <w:bCs/>
-        </w:rPr>
-        <w:t>derive_unique_all_case.sql</w:t>
-      </w:r>
-      <w:proofErr w:type="spellEnd"/>
+          <w:strike/>
+        </w:rPr>
+        <w:t xml:space="preserve">derive_unique_all_case.sql </w:t>
+      </w:r>
+      <w:r>
+        <w:rPr>
+          <w:strike/>
+        </w:rPr>
+        <w:t>script SQL script</w:t>
+      </w:r>
+    </w:p>
+    <w:p>
+      <w:pPr>
+        <w:pStyle w:val="Heading21"/>
+        <w:numPr>
+          <w:ilvl w:val="1"/>
+          <w:numId w:val="1"/>
+        </w:numPr>
+      </w:pPr>
+      <w:r>
+        <w:t>Map drug names to RxNorm</w:t>
+      </w:r>
+    </w:p>
+    <w:p/>
+    <w:p>
+      <w:r>
+        <w:t xml:space="preserve">The aim of this section of the process is to create a combined_drug_mapping table with the original drug name and the associated RxNorm concept_id.  </w:t>
+      </w:r>
+    </w:p>
+    <w:p/>
+    <w:p>
+      <w:pPr>
+        <w:numPr>
+          <w:ilvl w:val="0"/>
+          <w:numId w:val="7"/>
+        </w:numPr>
+        <w:tabs>
+          <w:tab w:val="left" w:pos="425"/>
+        </w:tabs>
+        <w:ind w:left="420" w:hanging="420"/>
+      </w:pPr>
+      <w:r>
+        <w:t xml:space="preserve">Run the </w:t>
+      </w:r>
       <w:r>
         <w:rPr>
           <w:b/>
           <w:bCs/>
-        </w:rPr>
-        <w:t xml:space="preserve"> </w:t>
-      </w:r>
-      <w:r>
-        <w:t>script SQL script</w:t>
-      </w:r>
-    </w:p>
-    <w:p>
-      <w:pPr>
-        <w:pStyle w:val="Heading21"/>
-        <w:numPr>
-          <w:ilvl w:val="1"/>
+          <w:highlight w:val="magenta"/>
+        </w:rPr>
+        <w:t>map_all_drug_name_to_rxnorm.sql</w:t>
+      </w:r>
+      <w:r>
+        <w:t xml:space="preserve"> script SQL script</w:t>
+      </w:r>
+    </w:p>
+    <w:p>
+      <w:pPr>
+        <w:pStyle w:val="Heading31"/>
+        <w:numPr>
+          <w:ilvl w:val="2"/>
           <w:numId w:val="1"/>
         </w:numPr>
       </w:pPr>
       <w:r>
-        <w:t xml:space="preserve">Map drug names to </w:t>
-      </w:r>
-      <w:proofErr w:type="spellStart"/>
-      <w:r>
-        <w:t>RxNorm</w:t>
-      </w:r>
-      <w:proofErr w:type="spellEnd"/>
+        <w:t>a) Map current data drug name to RxNorm -  Regular Expression</w:t>
+      </w:r>
     </w:p>
     <w:p/>
     <w:p>
-      <w:r>
-        <w:t xml:space="preserve">The aim of this section of the process is to create a </w:t>
-      </w:r>
-      <w:proofErr w:type="spellStart"/>
-      <w:r>
-        <w:t>combined_drug_mapping</w:t>
-      </w:r>
-      <w:proofErr w:type="spellEnd"/>
-      <w:r>
-        <w:t xml:space="preserve"> table with the original drug name and the associated </w:t>
-      </w:r>
-      <w:proofErr w:type="spellStart"/>
-      <w:r>
-        <w:t>RxNorm</w:t>
-      </w:r>
-      <w:proofErr w:type="spellEnd"/>
-      <w:r>
-        <w:t xml:space="preserve"> </w:t>
-      </w:r>
-      <w:proofErr w:type="spellStart"/>
-      <w:r>
-        <w:t>concept_id</w:t>
-      </w:r>
-      <w:proofErr w:type="spellEnd"/>
-      <w:r>
-        <w:t xml:space="preserve">.  </w:t>
-      </w:r>
-    </w:p>
-    <w:p/>
-    <w:p>
       <w:pPr>
         <w:numPr>
           <w:ilvl w:val="0"/>
@@ -1193,23 +1233,48 @@
         <w:tabs>
           <w:tab w:val="left" w:pos="425"/>
         </w:tabs>
-        <w:ind w:left="420" w:hanging="420"/>
-      </w:pPr>
-      <w:r>
-        <w:t xml:space="preserve">Run the </w:t>
-      </w:r>
-      <w:proofErr w:type="spellStart"/>
+      </w:pPr>
+      <w:r>
+        <w:t>The regex mapping section of the SQL script uses regular expression mapping of current data drug table drugname to the cdmv5.concept_table concept_name and generates the drug_regex_mapping table:</w:t>
+      </w:r>
+    </w:p>
+    <w:p>
+      <w:pPr>
+        <w:tabs>
+          <w:tab w:val="left" w:pos="425"/>
+        </w:tabs>
+      </w:pPr>
+    </w:p>
+    <w:p>
+      <w:pPr>
+        <w:numPr>
+          <w:ilvl w:val="0"/>
+          <w:numId w:val="7"/>
+        </w:numPr>
+        <w:tabs>
+          <w:tab w:val="left" w:pos="425"/>
+        </w:tabs>
+      </w:pPr>
       <w:r>
         <w:rPr>
           <w:b/>
           <w:bCs/>
         </w:rPr>
-        <w:t>map_all_drug_name_to_rxnorm.sql</w:t>
-      </w:r>
-      <w:proofErr w:type="spellEnd"/>
-      <w:r>
-        <w:t xml:space="preserve"> script SQL script</w:t>
-      </w:r>
+        <w:t>Note</w:t>
+      </w:r>
+      <w:r>
+        <w:t>:</w:t>
+      </w:r>
+      <w:r>
+        <w:t xml:space="preserve"> This will also create the combined_drug_mapping table with all unique current data drugnames, setting the update_type column to 'regex - &lt;regex type&gt;' and the concept_id to the  matching (RxNorm) concept_id in the drug_regex_mapping table.</w:t>
+      </w:r>
+    </w:p>
+    <w:p>
+      <w:pPr>
+        <w:tabs>
+          <w:tab w:val="left" w:pos="425"/>
+        </w:tabs>
+      </w:pPr>
     </w:p>
     <w:p>
       <w:pPr>
@@ -1220,15 +1285,7 @@
         </w:numPr>
       </w:pPr>
       <w:r>
-        <w:t xml:space="preserve">a) Map current data drug name to </w:t>
-      </w:r>
-      <w:proofErr w:type="spellStart"/>
-      <w:r>
-        <w:t>RxNorm</w:t>
-      </w:r>
-      <w:proofErr w:type="spellEnd"/>
-      <w:r>
-        <w:t xml:space="preserve"> -  Regular Expression</w:t>
+        <w:t>b) Map current data drug name to RxNorm – Active Ingredient</w:t>
       </w:r>
     </w:p>
     <w:p/>
@@ -1236,130 +1293,44 @@
       <w:pPr>
         <w:numPr>
           <w:ilvl w:val="0"/>
-          <w:numId w:val="7"/>
-        </w:numPr>
-        <w:tabs>
-          <w:tab w:val="left" w:pos="425"/>
-        </w:tabs>
-      </w:pPr>
-      <w:r>
-        <w:t xml:space="preserve">The regex mapping section of the SQL script uses regular expression mapping of current data drug table </w:t>
-      </w:r>
-      <w:proofErr w:type="spellStart"/>
-      <w:r>
-        <w:t>drugname</w:t>
-      </w:r>
-      <w:proofErr w:type="spellEnd"/>
-      <w:r>
-        <w:t xml:space="preserve"> to the cdmv5.concept_table </w:t>
-      </w:r>
-      <w:proofErr w:type="spellStart"/>
-      <w:r>
-        <w:t>concept_name</w:t>
-      </w:r>
-      <w:proofErr w:type="spellEnd"/>
-      <w:r>
-        <w:t xml:space="preserve"> and generates the </w:t>
-      </w:r>
-      <w:proofErr w:type="spellStart"/>
-      <w:r>
-        <w:t>drug_regex_mapping</w:t>
-      </w:r>
-      <w:proofErr w:type="spellEnd"/>
-      <w:r>
-        <w:t xml:space="preserve"> table:</w:t>
-      </w:r>
-    </w:p>
-    <w:p>
-      <w:pPr>
-        <w:tabs>
-          <w:tab w:val="left" w:pos="425"/>
-        </w:tabs>
-      </w:pPr>
-    </w:p>
-    <w:p>
-      <w:pPr>
-        <w:numPr>
-          <w:ilvl w:val="0"/>
-          <w:numId w:val="7"/>
-        </w:numPr>
-        <w:tabs>
-          <w:tab w:val="left" w:pos="425"/>
-        </w:tabs>
-      </w:pPr>
-      <w:r>
-        <w:t xml:space="preserve">Note. This will also create the </w:t>
-      </w:r>
-      <w:proofErr w:type="spellStart"/>
-      <w:r>
-        <w:t>combined_drug_mapping</w:t>
-      </w:r>
-      <w:proofErr w:type="spellEnd"/>
-      <w:r>
-        <w:t xml:space="preserve"> table with all unique current data </w:t>
-      </w:r>
-      <w:proofErr w:type="spellStart"/>
-      <w:r>
-        <w:t>drugnames</w:t>
-      </w:r>
-      <w:proofErr w:type="spellEnd"/>
-      <w:r>
-        <w:t xml:space="preserve">, setting the </w:t>
-      </w:r>
-      <w:proofErr w:type="spellStart"/>
-      <w:r>
-        <w:t>update_type</w:t>
-      </w:r>
-      <w:proofErr w:type="spellEnd"/>
-      <w:r>
-        <w:t xml:space="preserve"> column to 'regex - &lt;regex type&gt;' and the </w:t>
-      </w:r>
-      <w:proofErr w:type="spellStart"/>
-      <w:r>
-        <w:t>concept_id</w:t>
-      </w:r>
-      <w:proofErr w:type="spellEnd"/>
-      <w:r>
-        <w:t xml:space="preserve"> to </w:t>
-      </w:r>
-      <w:proofErr w:type="gramStart"/>
-      <w:r>
-        <w:t>the  matching</w:t>
-      </w:r>
-      <w:proofErr w:type="gramEnd"/>
-      <w:r>
-        <w:t xml:space="preserve"> (</w:t>
-      </w:r>
-      <w:proofErr w:type="spellStart"/>
-      <w:r>
-        <w:t>RxNorm</w:t>
-      </w:r>
-      <w:proofErr w:type="spellEnd"/>
-      <w:r>
-        <w:t xml:space="preserve">) </w:t>
-      </w:r>
-      <w:proofErr w:type="spellStart"/>
-      <w:r>
-        <w:t>concept_id</w:t>
-      </w:r>
-      <w:proofErr w:type="spellEnd"/>
-      <w:r>
-        <w:t xml:space="preserve"> in the </w:t>
-      </w:r>
-      <w:proofErr w:type="spellStart"/>
-      <w:r>
-        <w:t>drug_regex_mapping</w:t>
-      </w:r>
-      <w:proofErr w:type="spellEnd"/>
-      <w:r>
-        <w:t xml:space="preserve"> table.</w:t>
-      </w:r>
-    </w:p>
-    <w:p>
-      <w:pPr>
-        <w:tabs>
-          <w:tab w:val="left" w:pos="425"/>
-        </w:tabs>
+          <w:numId w:val="8"/>
+        </w:numPr>
+        <w:tabs>
+          <w:tab w:val="left" w:pos="425"/>
+        </w:tabs>
+      </w:pPr>
+      <w:r>
+        <w:lastRenderedPageBreak/>
+        <w:t>The Active Ingredient number mapping section of the SQL script generates the drug_ai_mapping table</w:t>
+      </w:r>
+    </w:p>
+    <w:p>
+      <w:pPr>
+        <w:tabs>
+          <w:tab w:val="left" w:pos="425"/>
+        </w:tabs>
+      </w:pPr>
+    </w:p>
+    <w:p>
+      <w:pPr>
+        <w:numPr>
+          <w:ilvl w:val="0"/>
+          <w:numId w:val="8"/>
+        </w:numPr>
+        <w:tabs>
+          <w:tab w:val="left" w:pos="425"/>
+        </w:tabs>
+      </w:pPr>
+      <w:r>
+        <w:t>Note. This will also set the combined_drug_mapping table update_type column to 'drug active ingredients' and the concept_id to the  matching (RxNorm) concept_id in the drug_regex_mapping table.</w:t>
+      </w:r>
+    </w:p>
+    <w:p>
+      <w:pPr>
+        <w:tabs>
+          <w:tab w:val="left" w:pos="425"/>
+        </w:tabs>
+        <w:ind w:left="425" w:hanging="425"/>
       </w:pPr>
     </w:p>
     <w:p>
@@ -1371,15 +1342,7 @@
         </w:numPr>
       </w:pPr>
       <w:r>
-        <w:t xml:space="preserve">b) Map current data drug name to </w:t>
-      </w:r>
-      <w:proofErr w:type="spellStart"/>
-      <w:r>
-        <w:t>RxNorm</w:t>
-      </w:r>
-      <w:proofErr w:type="spellEnd"/>
-      <w:r>
-        <w:t xml:space="preserve"> – Active Ingredient</w:t>
+        <w:t>c) Map current data drug name to RxNorm – NDA Number</w:t>
       </w:r>
     </w:p>
     <w:p/>
@@ -1387,99 +1350,35 @@
       <w:pPr>
         <w:numPr>
           <w:ilvl w:val="0"/>
-          <w:numId w:val="8"/>
-        </w:numPr>
-        <w:tabs>
-          <w:tab w:val="left" w:pos="425"/>
-        </w:tabs>
-      </w:pPr>
-      <w:r>
-        <w:t xml:space="preserve">The Active Ingredient number mapping section of the SQL script generates the </w:t>
-      </w:r>
-      <w:proofErr w:type="spellStart"/>
-      <w:r>
-        <w:t>drug_ai_mapping</w:t>
-      </w:r>
-      <w:proofErr w:type="spellEnd"/>
-      <w:r>
-        <w:t xml:space="preserve"> table</w:t>
-      </w:r>
-    </w:p>
-    <w:p>
-      <w:pPr>
-        <w:tabs>
-          <w:tab w:val="left" w:pos="425"/>
-        </w:tabs>
-      </w:pPr>
-    </w:p>
-    <w:p>
-      <w:pPr>
-        <w:numPr>
-          <w:ilvl w:val="0"/>
-          <w:numId w:val="8"/>
-        </w:numPr>
-        <w:tabs>
-          <w:tab w:val="left" w:pos="425"/>
-        </w:tabs>
-      </w:pPr>
-      <w:r>
-        <w:t xml:space="preserve">Note. This will also set the </w:t>
-      </w:r>
-      <w:proofErr w:type="spellStart"/>
-      <w:r>
-        <w:t>combined_drug_mapping</w:t>
-      </w:r>
-      <w:proofErr w:type="spellEnd"/>
-      <w:r>
-        <w:t xml:space="preserve"> table </w:t>
-      </w:r>
-      <w:proofErr w:type="spellStart"/>
-      <w:r>
-        <w:t>update_type</w:t>
-      </w:r>
-      <w:proofErr w:type="spellEnd"/>
-      <w:r>
-        <w:t xml:space="preserve"> column to 'drug active ingredients' and the </w:t>
-      </w:r>
-      <w:proofErr w:type="spellStart"/>
-      <w:r>
-        <w:t>concept_id</w:t>
-      </w:r>
-      <w:proofErr w:type="spellEnd"/>
-      <w:r>
-        <w:t xml:space="preserve"> to </w:t>
-      </w:r>
-      <w:proofErr w:type="gramStart"/>
-      <w:r>
-        <w:t>the  matching</w:t>
-      </w:r>
-      <w:proofErr w:type="gramEnd"/>
-      <w:r>
-        <w:t xml:space="preserve"> (</w:t>
-      </w:r>
-      <w:proofErr w:type="spellStart"/>
-      <w:r>
-        <w:t>RxNorm</w:t>
-      </w:r>
-      <w:proofErr w:type="spellEnd"/>
-      <w:r>
-        <w:t xml:space="preserve">) </w:t>
-      </w:r>
-      <w:proofErr w:type="spellStart"/>
-      <w:r>
-        <w:t>concept_id</w:t>
-      </w:r>
-      <w:proofErr w:type="spellEnd"/>
-      <w:r>
-        <w:t xml:space="preserve"> in the </w:t>
-      </w:r>
-      <w:proofErr w:type="spellStart"/>
-      <w:r>
-        <w:t>drug_regex_mapping</w:t>
-      </w:r>
-      <w:proofErr w:type="spellEnd"/>
-      <w:r>
-        <w:t xml:space="preserve"> table.</w:t>
+          <w:numId w:val="9"/>
+        </w:numPr>
+        <w:tabs>
+          <w:tab w:val="left" w:pos="425"/>
+        </w:tabs>
+      </w:pPr>
+      <w:r>
+        <w:t>The NDA number mapping section of the SQL script generates the drug_nda_mapping table</w:t>
+      </w:r>
+    </w:p>
+    <w:p>
+      <w:pPr>
+        <w:tabs>
+          <w:tab w:val="left" w:pos="425"/>
+        </w:tabs>
+      </w:pPr>
+    </w:p>
+    <w:p>
+      <w:pPr>
+        <w:numPr>
+          <w:ilvl w:val="0"/>
+          <w:numId w:val="9"/>
+        </w:numPr>
+        <w:tabs>
+          <w:tab w:val="left" w:pos="425"/>
+        </w:tabs>
+      </w:pPr>
+      <w:r>
+        <w:t>Note. This will also set the combined_drug_mapping table update_type column to 'drug nda_num ingredients' and the concept_id to the  matching (RxNorm) concept_id in the drug_ai_mapping table.</w:t>
       </w:r>
     </w:p>
     <w:p>
@@ -1499,155 +1398,118 @@
         </w:numPr>
       </w:pPr>
       <w:r>
-        <w:t xml:space="preserve">c) Map current data drug name to </w:t>
-      </w:r>
-      <w:proofErr w:type="spellStart"/>
-      <w:r>
-        <w:t>RxNorm</w:t>
-      </w:r>
-      <w:proofErr w:type="spellEnd"/>
-      <w:r>
-        <w:t xml:space="preserve"> – NDA Number</w:t>
+        <w:t>d) Map current data drug name to RxNorm - USAGI</w:t>
       </w:r>
     </w:p>
     <w:p/>
     <w:p>
       <w:pPr>
-        <w:numPr>
-          <w:ilvl w:val="0"/>
-          <w:numId w:val="9"/>
-        </w:numPr>
-        <w:tabs>
-          <w:tab w:val="left" w:pos="425"/>
-        </w:tabs>
-      </w:pPr>
-      <w:r>
-        <w:lastRenderedPageBreak/>
-        <w:t xml:space="preserve">The NDA number mapping section of the SQL script generates the </w:t>
-      </w:r>
-      <w:proofErr w:type="spellStart"/>
-      <w:r>
-        <w:t>drug_nda_mapping</w:t>
-      </w:r>
-      <w:proofErr w:type="spellEnd"/>
-      <w:r>
-        <w:t xml:space="preserve"> table</w:t>
-      </w:r>
-    </w:p>
-    <w:p>
-      <w:pPr>
-        <w:tabs>
-          <w:tab w:val="left" w:pos="425"/>
-        </w:tabs>
-      </w:pPr>
-    </w:p>
-    <w:p>
-      <w:pPr>
-        <w:numPr>
-          <w:ilvl w:val="0"/>
-          <w:numId w:val="9"/>
-        </w:numPr>
-        <w:tabs>
-          <w:tab w:val="left" w:pos="425"/>
-        </w:tabs>
-      </w:pPr>
-      <w:r>
-        <w:t xml:space="preserve">Note. This will also set the </w:t>
-      </w:r>
-      <w:proofErr w:type="spellStart"/>
-      <w:r>
-        <w:t>combined_drug_mapping</w:t>
-      </w:r>
-      <w:proofErr w:type="spellEnd"/>
-      <w:r>
-        <w:t xml:space="preserve"> table </w:t>
-      </w:r>
-      <w:proofErr w:type="spellStart"/>
-      <w:r>
-        <w:t>update_type</w:t>
-      </w:r>
-      <w:proofErr w:type="spellEnd"/>
-      <w:r>
-        <w:t xml:space="preserve"> column to 'drug </w:t>
-      </w:r>
-      <w:proofErr w:type="spellStart"/>
-      <w:r>
-        <w:t>nda_num</w:t>
-      </w:r>
-      <w:proofErr w:type="spellEnd"/>
-      <w:r>
-        <w:t xml:space="preserve"> ingredients' and the </w:t>
-      </w:r>
-      <w:proofErr w:type="spellStart"/>
-      <w:r>
-        <w:t>concept_id</w:t>
-      </w:r>
-      <w:proofErr w:type="spellEnd"/>
-      <w:r>
-        <w:t xml:space="preserve"> to </w:t>
-      </w:r>
-      <w:proofErr w:type="gramStart"/>
-      <w:r>
-        <w:t>the  matching</w:t>
-      </w:r>
-      <w:proofErr w:type="gramEnd"/>
-      <w:r>
-        <w:t xml:space="preserve"> (</w:t>
-      </w:r>
-      <w:proofErr w:type="spellStart"/>
-      <w:r>
-        <w:t>RxNorm</w:t>
-      </w:r>
-      <w:proofErr w:type="spellEnd"/>
-      <w:r>
-        <w:t xml:space="preserve">) </w:t>
-      </w:r>
-      <w:proofErr w:type="spellStart"/>
-      <w:r>
-        <w:t>concept_id</w:t>
-      </w:r>
-      <w:proofErr w:type="spellEnd"/>
-      <w:r>
-        <w:t xml:space="preserve"> in the </w:t>
-      </w:r>
-      <w:proofErr w:type="spellStart"/>
-      <w:r>
-        <w:t>drug_ai_mapping</w:t>
-      </w:r>
-      <w:proofErr w:type="spellEnd"/>
-      <w:r>
-        <w:t xml:space="preserve"> table.</w:t>
-      </w:r>
-    </w:p>
-    <w:p>
-      <w:pPr>
-        <w:tabs>
-          <w:tab w:val="left" w:pos="425"/>
-        </w:tabs>
-        <w:ind w:left="425" w:hanging="425"/>
-      </w:pPr>
-    </w:p>
-    <w:p>
-      <w:pPr>
-        <w:pStyle w:val="Heading31"/>
-        <w:numPr>
-          <w:ilvl w:val="2"/>
-          <w:numId w:val="1"/>
-        </w:numPr>
-      </w:pPr>
-      <w:r>
-        <w:t xml:space="preserve">d) Map current data drug name to </w:t>
-      </w:r>
-      <w:proofErr w:type="spellStart"/>
-      <w:r>
-        <w:t>RxNorm</w:t>
-      </w:r>
-      <w:proofErr w:type="spellEnd"/>
-      <w:r>
-        <w:t xml:space="preserve"> - USAGI</w:t>
-      </w:r>
-    </w:p>
-    <w:p/>
+        <w:pStyle w:val="ListParagraph"/>
+        <w:widowControl/>
+        <w:numPr>
+          <w:ilvl w:val="0"/>
+          <w:numId w:val="10"/>
+        </w:numPr>
+        <w:shd w:val="clear" w:color="auto" w:fill="FFFFFF"/>
+        <w:suppressAutoHyphens w:val="0"/>
+        <w:rPr>
+          <w:rFonts w:ascii="Arial" w:eastAsia="Times New Roman" w:hAnsi="Arial" w:cs="Arial"/>
+          <w:strike/>
+          <w:color w:val="222222"/>
+          <w:sz w:val="19"/>
+          <w:szCs w:val="19"/>
+          <w:lang w:eastAsia="en-US"/>
+        </w:rPr>
+      </w:pPr>
+      <w:r>
+        <w:rPr>
+          <w:rFonts w:ascii="Arial" w:eastAsia="Times New Roman" w:hAnsi="Arial" w:cs="Arial"/>
+          <w:strike/>
+          <w:color w:val="222222"/>
+          <w:sz w:val="19"/>
+          <w:szCs w:val="19"/>
+          <w:lang w:eastAsia="en-US"/>
+        </w:rPr>
+        <w:t xml:space="preserve">Run the </w:t>
+      </w:r>
+      <w:r>
+        <w:rPr>
+          <w:rFonts w:ascii="Arial" w:eastAsia="Times New Roman" w:hAnsi="Arial" w:cs="Arial"/>
+          <w:strike/>
+          <w:color w:val="222222"/>
+          <w:sz w:val="19"/>
+          <w:szCs w:val="19"/>
+          <w:highlight w:val="red"/>
+          <w:lang w:eastAsia="en-US"/>
+        </w:rPr>
+        <w:t>create_drug_usagi_mapping_table.sql</w:t>
+      </w:r>
+      <w:r>
+        <w:rPr>
+          <w:rFonts w:ascii="Arial" w:eastAsia="Times New Roman" w:hAnsi="Arial" w:cs="Arial"/>
+          <w:strike/>
+          <w:color w:val="222222"/>
+          <w:sz w:val="19"/>
+          <w:szCs w:val="19"/>
+          <w:lang w:eastAsia="en-US"/>
+        </w:rPr>
+        <w:t xml:space="preserve"> SQL script to create the drug_usagi_mapping table.</w:t>
+      </w:r>
+    </w:p>
+    <w:p>
+      <w:pPr>
+        <w:pStyle w:val="ListParagraph"/>
+        <w:widowControl/>
+        <w:numPr>
+          <w:ilvl w:val="0"/>
+          <w:numId w:val="10"/>
+        </w:numPr>
+        <w:shd w:val="clear" w:color="auto" w:fill="FFFFFF"/>
+        <w:suppressAutoHyphens w:val="0"/>
+        <w:rPr>
+          <w:rFonts w:ascii="Arial" w:eastAsia="Times New Roman" w:hAnsi="Arial" w:cs="Arial"/>
+          <w:strike/>
+          <w:color w:val="222222"/>
+          <w:sz w:val="19"/>
+          <w:szCs w:val="19"/>
+          <w:lang w:eastAsia="en-US"/>
+        </w:rPr>
+      </w:pPr>
+      <w:r>
+        <w:rPr>
+          <w:rFonts w:ascii="Arial" w:eastAsia="Times New Roman" w:hAnsi="Arial" w:cs="Arial"/>
+          <w:strike/>
+          <w:color w:val="222222"/>
+          <w:sz w:val="19"/>
+          <w:szCs w:val="19"/>
+          <w:lang w:eastAsia="en-US"/>
+        </w:rPr>
+        <w:t xml:space="preserve">Run the </w:t>
+      </w:r>
+      <w:r>
+        <w:rPr>
+          <w:rFonts w:ascii="Arial" w:eastAsia="Times New Roman" w:hAnsi="Arial" w:cs="Arial"/>
+          <w:strike/>
+          <w:color w:val="222222"/>
+          <w:sz w:val="19"/>
+          <w:szCs w:val="19"/>
+          <w:highlight w:val="magenta"/>
+          <w:lang w:eastAsia="en-US"/>
+        </w:rPr>
+        <w:t>create_usagi_import_table.sql</w:t>
+      </w:r>
+      <w:r>
+        <w:rPr>
+          <w:rFonts w:ascii="Arial" w:eastAsia="Times New Roman" w:hAnsi="Arial" w:cs="Arial"/>
+          <w:strike/>
+          <w:color w:val="222222"/>
+          <w:sz w:val="19"/>
+          <w:szCs w:val="19"/>
+          <w:lang w:eastAsia="en-US"/>
+        </w:rPr>
+        <w:t xml:space="preserve"> SQL script to create the usagi_import table.</w:t>
+      </w:r>
+    </w:p>
     <w:p>
       <w:pPr>
         <w:pStyle w:val="ListParagraph"/>
@@ -1674,9 +1536,8 @@
           <w:szCs w:val="19"/>
           <w:lang w:eastAsia="en-US"/>
         </w:rPr>
-        <w:t xml:space="preserve">Run the </w:t>
-      </w:r>
-      <w:proofErr w:type="spellStart"/>
+        <w:t>R</w:t>
+      </w:r>
       <w:r>
         <w:rPr>
           <w:rFonts w:ascii="Arial" w:eastAsia="Times New Roman" w:hAnsi="Arial" w:cs="Arial"/>
@@ -1685,9 +1546,19 @@
           <w:szCs w:val="19"/>
           <w:lang w:eastAsia="en-US"/>
         </w:rPr>
-        <w:t>create_drug_usagi_mapping_table.sql</w:t>
-      </w:r>
-      <w:proofErr w:type="spellEnd"/>
+        <w:t xml:space="preserve">un the </w:t>
+      </w:r>
+      <w:r>
+        <w:rPr>
+          <w:rFonts w:ascii="Arial" w:eastAsia="Times New Roman" w:hAnsi="Arial" w:cs="Arial"/>
+          <w:color w:val="222222"/>
+          <w:sz w:val="19"/>
+          <w:szCs w:val="19"/>
+          <w:highlight w:val="magenta"/>
+          <w:lang w:eastAsia="en-US"/>
+        </w:rPr>
+        <w:t>generate_drug_export_for_usagi.sql</w:t>
+      </w:r>
       <w:r>
         <w:rPr>
           <w:rFonts w:ascii="Arial" w:eastAsia="Times New Roman" w:hAnsi="Arial" w:cs="Arial"/>
@@ -1696,9 +1567,8 @@
           <w:szCs w:val="19"/>
           <w:lang w:eastAsia="en-US"/>
         </w:rPr>
-        <w:t xml:space="preserve"> SQL script to create the </w:t>
-      </w:r>
-      <w:proofErr w:type="spellStart"/>
+        <w:t xml:space="preserve"> SQL script to generate </w:t>
+      </w:r>
       <w:r>
         <w:rPr>
           <w:rFonts w:ascii="Arial" w:eastAsia="Times New Roman" w:hAnsi="Arial" w:cs="Arial"/>
@@ -1707,9 +1577,8 @@
           <w:szCs w:val="19"/>
           <w:lang w:eastAsia="en-US"/>
         </w:rPr>
-        <w:t>drug_usagi_mapping</w:t>
-      </w:r>
-      <w:proofErr w:type="spellEnd"/>
+        <w:t xml:space="preserve">the </w:t>
+      </w:r>
       <w:r>
         <w:rPr>
           <w:rFonts w:ascii="Arial" w:eastAsia="Times New Roman" w:hAnsi="Arial" w:cs="Arial"/>
@@ -1718,19 +1587,9 @@
           <w:szCs w:val="19"/>
           <w:lang w:eastAsia="en-US"/>
         </w:rPr>
-        <w:t xml:space="preserve"> table.</w:t>
-      </w:r>
-    </w:p>
-    <w:p>
-      <w:pPr>
-        <w:pStyle w:val="ListParagraph"/>
-        <w:widowControl/>
-        <w:numPr>
-          <w:ilvl w:val="0"/>
-          <w:numId w:val="10"/>
-        </w:numPr>
-        <w:shd w:val="clear" w:color="auto" w:fill="FFFFFF"/>
-        <w:suppressAutoHyphens w:val="0"/>
+        <w:t>set of unmapped codes</w:t>
+      </w:r>
+      <w:r>
         <w:rPr>
           <w:rFonts w:ascii="Arial" w:eastAsia="Times New Roman" w:hAnsi="Arial" w:cs="Arial"/>
           <w:color w:val="222222"/>
@@ -1738,8 +1597,19 @@
           <w:szCs w:val="19"/>
           <w:lang w:eastAsia="en-US"/>
         </w:rPr>
-      </w:pPr>
-      <w:r>
+        <w:t>.</w:t>
+      </w:r>
+    </w:p>
+    <w:p>
+      <w:pPr>
+        <w:pStyle w:val="ListParagraph"/>
+        <w:widowControl/>
+        <w:numPr>
+          <w:ilvl w:val="0"/>
+          <w:numId w:val="10"/>
+        </w:numPr>
+        <w:shd w:val="clear" w:color="auto" w:fill="FFFFFF"/>
+        <w:suppressAutoHyphens w:val="0"/>
         <w:rPr>
           <w:rFonts w:ascii="Arial" w:eastAsia="Times New Roman" w:hAnsi="Arial" w:cs="Arial"/>
           <w:color w:val="222222"/>
@@ -1747,9 +1617,7 @@
           <w:szCs w:val="19"/>
           <w:lang w:eastAsia="en-US"/>
         </w:rPr>
-        <w:t xml:space="preserve">Run the </w:t>
-      </w:r>
-      <w:proofErr w:type="spellStart"/>
+      </w:pPr>
       <w:r>
         <w:rPr>
           <w:rFonts w:ascii="Arial" w:eastAsia="Times New Roman" w:hAnsi="Arial" w:cs="Arial"/>
@@ -1758,9 +1626,8 @@
           <w:szCs w:val="19"/>
           <w:lang w:eastAsia="en-US"/>
         </w:rPr>
-        <w:t>create_usagi_import_table.sql</w:t>
-      </w:r>
-      <w:proofErr w:type="spellEnd"/>
+        <w:t>E</w:t>
+      </w:r>
       <w:r>
         <w:rPr>
           <w:rFonts w:ascii="Arial" w:eastAsia="Times New Roman" w:hAnsi="Arial" w:cs="Arial"/>
@@ -1769,9 +1636,8 @@
           <w:szCs w:val="19"/>
           <w:lang w:eastAsia="en-US"/>
         </w:rPr>
-        <w:t xml:space="preserve"> SQL script to create the </w:t>
-      </w:r>
-      <w:proofErr w:type="spellStart"/>
+        <w:t xml:space="preserve">xport </w:t>
+      </w:r>
       <w:r>
         <w:rPr>
           <w:rFonts w:ascii="Arial" w:eastAsia="Times New Roman" w:hAnsi="Arial" w:cs="Arial"/>
@@ -1780,9 +1646,8 @@
           <w:szCs w:val="19"/>
           <w:lang w:eastAsia="en-US"/>
         </w:rPr>
-        <w:t>usagi_import</w:t>
-      </w:r>
-      <w:proofErr w:type="spellEnd"/>
+        <w:t xml:space="preserve">the set of </w:t>
+      </w:r>
       <w:r>
         <w:rPr>
           <w:rFonts w:ascii="Arial" w:eastAsia="Times New Roman" w:hAnsi="Arial" w:cs="Arial"/>
@@ -1791,19 +1656,9 @@
           <w:szCs w:val="19"/>
           <w:lang w:eastAsia="en-US"/>
         </w:rPr>
-        <w:t xml:space="preserve"> table.</w:t>
-      </w:r>
-    </w:p>
-    <w:p>
-      <w:pPr>
-        <w:pStyle w:val="ListParagraph"/>
-        <w:widowControl/>
-        <w:numPr>
-          <w:ilvl w:val="0"/>
-          <w:numId w:val="10"/>
-        </w:numPr>
-        <w:shd w:val="clear" w:color="auto" w:fill="FFFFFF"/>
-        <w:suppressAutoHyphens w:val="0"/>
+        <w:t>unmapped codes to a file using pgadmin client export functionality</w:t>
+      </w:r>
+      <w:r>
         <w:rPr>
           <w:rFonts w:ascii="Arial" w:eastAsia="Times New Roman" w:hAnsi="Arial" w:cs="Arial"/>
           <w:color w:val="222222"/>
@@ -1811,8 +1666,19 @@
           <w:szCs w:val="19"/>
           <w:lang w:eastAsia="en-US"/>
         </w:rPr>
-      </w:pPr>
-      <w:r>
+        <w:t>.</w:t>
+      </w:r>
+    </w:p>
+    <w:p>
+      <w:pPr>
+        <w:pStyle w:val="ListParagraph"/>
+        <w:widowControl/>
+        <w:numPr>
+          <w:ilvl w:val="0"/>
+          <w:numId w:val="10"/>
+        </w:numPr>
+        <w:shd w:val="clear" w:color="auto" w:fill="FFFFFF"/>
+        <w:suppressAutoHyphens w:val="0"/>
         <w:rPr>
           <w:rFonts w:ascii="Arial" w:eastAsia="Times New Roman" w:hAnsi="Arial" w:cs="Arial"/>
           <w:color w:val="222222"/>
@@ -1820,8 +1686,7 @@
           <w:szCs w:val="19"/>
           <w:lang w:eastAsia="en-US"/>
         </w:rPr>
-        <w:t>R</w:t>
-      </w:r>
+      </w:pPr>
       <w:r>
         <w:rPr>
           <w:rFonts w:ascii="Arial" w:eastAsia="Times New Roman" w:hAnsi="Arial" w:cs="Arial"/>
@@ -1830,9 +1695,8 @@
           <w:szCs w:val="19"/>
           <w:lang w:eastAsia="en-US"/>
         </w:rPr>
-        <w:t xml:space="preserve">un the </w:t>
-      </w:r>
-      <w:proofErr w:type="spellStart"/>
+        <w:t>L</w:t>
+      </w:r>
       <w:r>
         <w:rPr>
           <w:rFonts w:ascii="Arial" w:eastAsia="Times New Roman" w:hAnsi="Arial" w:cs="Arial"/>
@@ -1841,9 +1705,8 @@
           <w:szCs w:val="19"/>
           <w:lang w:eastAsia="en-US"/>
         </w:rPr>
-        <w:t>generate_drug_export_for_usagi.sql</w:t>
-      </w:r>
-      <w:proofErr w:type="spellEnd"/>
+        <w:t xml:space="preserve">oad the file into </w:t>
+      </w:r>
       <w:r>
         <w:rPr>
           <w:rFonts w:ascii="Arial" w:eastAsia="Times New Roman" w:hAnsi="Arial" w:cs="Arial"/>
@@ -1852,7 +1715,7 @@
           <w:szCs w:val="19"/>
           <w:lang w:eastAsia="en-US"/>
         </w:rPr>
-        <w:t xml:space="preserve"> SQL script to generate </w:t>
+        <w:t>the USAGI tool</w:t>
       </w:r>
       <w:r>
         <w:rPr>
@@ -1862,7 +1725,7 @@
           <w:szCs w:val="19"/>
           <w:lang w:eastAsia="en-US"/>
         </w:rPr>
-        <w:t xml:space="preserve">the </w:t>
+        <w:t xml:space="preserve"> for manual mapping</w:t>
       </w:r>
       <w:r>
         <w:rPr>
@@ -1872,9 +1735,82 @@
           <w:szCs w:val="19"/>
           <w:lang w:eastAsia="en-US"/>
         </w:rPr>
-        <w:t>set of unmapped codes</w:t>
-      </w:r>
-      <w:r>
+        <w:t>.</w:t>
+      </w:r>
+    </w:p>
+    <w:p>
+      <w:pPr>
+        <w:numPr>
+          <w:ilvl w:val="0"/>
+          <w:numId w:val="10"/>
+        </w:numPr>
+        <w:tabs>
+          <w:tab w:val="left" w:pos="425"/>
+        </w:tabs>
+      </w:pPr>
+      <w:r>
+        <w:t xml:space="preserve">Open the USAGI tool.  Follow the instructions on the </w:t>
+      </w:r>
+      <w:hyperlink r:id="rId10">
+        <w:r>
+          <w:rPr>
+            <w:rStyle w:val="InternetLink"/>
+          </w:rPr>
+          <w:t xml:space="preserve">USAGI  </w:t>
+        </w:r>
+        <w:r>
+          <w:rPr>
+            <w:rStyle w:val="InternetLink"/>
+          </w:rPr>
+          <w:t>O</w:t>
+        </w:r>
+        <w:r>
+          <w:rPr>
+            <w:rStyle w:val="InternetLink"/>
+          </w:rPr>
+          <w:t>HDSI wiki page</w:t>
+        </w:r>
+      </w:hyperlink>
+      <w:r>
+        <w:t xml:space="preserve"> to initialize and load the data file into USAGI. Note. As part of USAGI setup you will need the CDMV5 vocabulary data files from the Athena website.</w:t>
+      </w:r>
+    </w:p>
+    <w:p>
+      <w:pPr>
+        <w:numPr>
+          <w:ilvl w:val="0"/>
+          <w:numId w:val="10"/>
+        </w:numPr>
+        <w:tabs>
+          <w:tab w:val="left" w:pos="425"/>
+        </w:tabs>
+      </w:pPr>
+      <w:r>
+        <w:t xml:space="preserve">Manually map </w:t>
+      </w:r>
+      <w:r>
+        <w:t>some % of the</w:t>
+      </w:r>
+      <w:r>
+        <w:t xml:space="preserve"> drug names to RxNorm concept_ids in USAGI </w:t>
+      </w:r>
+      <w:r>
+        <w:t>prioritized by descending frequency of occurrence and</w:t>
+      </w:r>
+      <w:r>
+        <w:t xml:space="preserve"> export the results to a file.</w:t>
+      </w:r>
+    </w:p>
+    <w:p>
+      <w:pPr>
+        <w:pStyle w:val="ListParagraph"/>
+        <w:widowControl/>
+        <w:numPr>
+          <w:ilvl w:val="0"/>
+          <w:numId w:val="10"/>
+        </w:numPr>
+        <w:shd w:val="clear" w:color="auto" w:fill="FFFFFF"/>
+        <w:suppressAutoHyphens w:val="0"/>
         <w:rPr>
           <w:rFonts w:ascii="Arial" w:eastAsia="Times New Roman" w:hAnsi="Arial" w:cs="Arial"/>
           <w:color w:val="222222"/>
@@ -1882,19 +1818,8 @@
           <w:szCs w:val="19"/>
           <w:lang w:eastAsia="en-US"/>
         </w:rPr>
-        <w:t>.</w:t>
-      </w:r>
-    </w:p>
-    <w:p>
-      <w:pPr>
-        <w:pStyle w:val="ListParagraph"/>
-        <w:widowControl/>
-        <w:numPr>
-          <w:ilvl w:val="0"/>
-          <w:numId w:val="10"/>
-        </w:numPr>
-        <w:shd w:val="clear" w:color="auto" w:fill="FFFFFF"/>
-        <w:suppressAutoHyphens w:val="0"/>
+      </w:pPr>
+      <w:r>
         <w:rPr>
           <w:rFonts w:ascii="Arial" w:eastAsia="Times New Roman" w:hAnsi="Arial" w:cs="Arial"/>
           <w:color w:val="222222"/>
@@ -1902,7 +1827,8 @@
           <w:szCs w:val="19"/>
           <w:lang w:eastAsia="en-US"/>
         </w:rPr>
-      </w:pPr>
+        <w:t>E</w:t>
+      </w:r>
       <w:r>
         <w:rPr>
           <w:rFonts w:ascii="Arial" w:eastAsia="Times New Roman" w:hAnsi="Arial" w:cs="Arial"/>
@@ -1911,7 +1837,7 @@
           <w:szCs w:val="19"/>
           <w:lang w:eastAsia="en-US"/>
         </w:rPr>
-        <w:t>E</w:t>
+        <w:t xml:space="preserve">xport </w:t>
       </w:r>
       <w:r>
         <w:rPr>
@@ -1921,7 +1847,7 @@
           <w:szCs w:val="19"/>
           <w:lang w:eastAsia="en-US"/>
         </w:rPr>
-        <w:t xml:space="preserve">xport </w:t>
+        <w:t xml:space="preserve">the </w:t>
       </w:r>
       <w:r>
         <w:rPr>
@@ -1931,7 +1857,7 @@
           <w:szCs w:val="19"/>
           <w:lang w:eastAsia="en-US"/>
         </w:rPr>
-        <w:t xml:space="preserve">the set of </w:t>
+        <w:t xml:space="preserve">mapped codes from </w:t>
       </w:r>
       <w:r>
         <w:rPr>
@@ -1941,9 +1867,8 @@
           <w:szCs w:val="19"/>
           <w:lang w:eastAsia="en-US"/>
         </w:rPr>
-        <w:t xml:space="preserve">unmapped codes to a file using </w:t>
-      </w:r>
-      <w:proofErr w:type="spellStart"/>
+        <w:t>USAGI</w:t>
+      </w:r>
       <w:r>
         <w:rPr>
           <w:rFonts w:ascii="Arial" w:eastAsia="Times New Roman" w:hAnsi="Arial" w:cs="Arial"/>
@@ -1952,9 +1877,8 @@
           <w:szCs w:val="19"/>
           <w:lang w:eastAsia="en-US"/>
         </w:rPr>
-        <w:t>pgadmin</w:t>
-      </w:r>
-      <w:proofErr w:type="spellEnd"/>
+        <w:t xml:space="preserve"> to a file</w:t>
+      </w:r>
       <w:r>
         <w:rPr>
           <w:rFonts w:ascii="Arial" w:eastAsia="Times New Roman" w:hAnsi="Arial" w:cs="Arial"/>
@@ -1963,9 +1887,19 @@
           <w:szCs w:val="19"/>
           <w:lang w:eastAsia="en-US"/>
         </w:rPr>
-        <w:t xml:space="preserve"> client export functionality</w:t>
-      </w:r>
-      <w:r>
+        <w:t>.</w:t>
+      </w:r>
+    </w:p>
+    <w:p>
+      <w:pPr>
+        <w:pStyle w:val="ListParagraph"/>
+        <w:widowControl/>
+        <w:numPr>
+          <w:ilvl w:val="0"/>
+          <w:numId w:val="10"/>
+        </w:numPr>
+        <w:shd w:val="clear" w:color="auto" w:fill="FFFFFF"/>
+        <w:suppressAutoHyphens w:val="0"/>
         <w:rPr>
           <w:rFonts w:ascii="Arial" w:eastAsia="Times New Roman" w:hAnsi="Arial" w:cs="Arial"/>
           <w:color w:val="222222"/>
@@ -1973,19 +1907,8 @@
           <w:szCs w:val="19"/>
           <w:lang w:eastAsia="en-US"/>
         </w:rPr>
-        <w:t>.</w:t>
-      </w:r>
-    </w:p>
-    <w:p>
-      <w:pPr>
-        <w:pStyle w:val="ListParagraph"/>
-        <w:widowControl/>
-        <w:numPr>
-          <w:ilvl w:val="0"/>
-          <w:numId w:val="10"/>
-        </w:numPr>
-        <w:shd w:val="clear" w:color="auto" w:fill="FFFFFF"/>
-        <w:suppressAutoHyphens w:val="0"/>
+      </w:pPr>
+      <w:r>
         <w:rPr>
           <w:rFonts w:ascii="Arial" w:eastAsia="Times New Roman" w:hAnsi="Arial" w:cs="Arial"/>
           <w:color w:val="222222"/>
@@ -1993,7 +1916,8 @@
           <w:szCs w:val="19"/>
           <w:lang w:eastAsia="en-US"/>
         </w:rPr>
-      </w:pPr>
+        <w:t>L</w:t>
+      </w:r>
       <w:r>
         <w:rPr>
           <w:rFonts w:ascii="Arial" w:eastAsia="Times New Roman" w:hAnsi="Arial" w:cs="Arial"/>
@@ -2002,7 +1926,7 @@
           <w:szCs w:val="19"/>
           <w:lang w:eastAsia="en-US"/>
         </w:rPr>
-        <w:t>L</w:t>
+        <w:t xml:space="preserve">oad </w:t>
       </w:r>
       <w:r>
         <w:rPr>
@@ -2012,7 +1936,7 @@
           <w:szCs w:val="19"/>
           <w:lang w:eastAsia="en-US"/>
         </w:rPr>
-        <w:t xml:space="preserve">oad the file into </w:t>
+        <w:t>the USAGI</w:t>
       </w:r>
       <w:r>
         <w:rPr>
@@ -2022,7 +1946,7 @@
           <w:szCs w:val="19"/>
           <w:lang w:eastAsia="en-US"/>
         </w:rPr>
-        <w:t>the USAGI tool</w:t>
+        <w:t xml:space="preserve"> mapped codes file into </w:t>
       </w:r>
       <w:r>
         <w:rPr>
@@ -2032,7 +1956,7 @@
           <w:szCs w:val="19"/>
           <w:lang w:eastAsia="en-US"/>
         </w:rPr>
-        <w:t xml:space="preserve"> for manual mapping</w:t>
+        <w:t xml:space="preserve">the </w:t>
       </w:r>
       <w:r>
         <w:rPr>
@@ -2042,74 +1966,7 @@
           <w:szCs w:val="19"/>
           <w:lang w:eastAsia="en-US"/>
         </w:rPr>
-        <w:t>.</w:t>
-      </w:r>
-    </w:p>
-    <w:p>
-      <w:pPr>
-        <w:numPr>
-          <w:ilvl w:val="0"/>
-          <w:numId w:val="10"/>
-        </w:numPr>
-        <w:tabs>
-          <w:tab w:val="left" w:pos="425"/>
-        </w:tabs>
-      </w:pPr>
-      <w:r>
-        <w:t xml:space="preserve">Open the USAGI tool.  Follow the instructions on the </w:t>
-      </w:r>
-      <w:hyperlink r:id="rId10">
-        <w:r>
-          <w:rPr>
-            <w:rStyle w:val="InternetLink"/>
-          </w:rPr>
-          <w:t>USAGI  OHDSI wiki page</w:t>
-        </w:r>
-      </w:hyperlink>
-      <w:r>
-        <w:t xml:space="preserve"> to initialize and load the data file into USAGI. Note. As part of USAGI setup you will need the CDMV5 vocabulary data files from the Athena website.</w:t>
-      </w:r>
-    </w:p>
-    <w:p>
-      <w:pPr>
-        <w:numPr>
-          <w:ilvl w:val="0"/>
-          <w:numId w:val="10"/>
-        </w:numPr>
-        <w:tabs>
-          <w:tab w:val="left" w:pos="425"/>
-        </w:tabs>
-      </w:pPr>
-      <w:r>
-        <w:t xml:space="preserve">Manually map </w:t>
-      </w:r>
-      <w:r>
-        <w:t>some % of the</w:t>
-      </w:r>
-      <w:r>
-        <w:t xml:space="preserve"> drug names to </w:t>
-      </w:r>
-      <w:proofErr w:type="spellStart"/>
-      <w:r>
-        <w:t>RxNorm</w:t>
-      </w:r>
-      <w:proofErr w:type="spellEnd"/>
-      <w:r>
-        <w:t xml:space="preserve"> </w:t>
-      </w:r>
-      <w:proofErr w:type="spellStart"/>
-      <w:r>
-        <w:t>concept_ids</w:t>
-      </w:r>
-      <w:proofErr w:type="spellEnd"/>
-      <w:r>
-        <w:t xml:space="preserve"> in USAGI </w:t>
-      </w:r>
-      <w:r>
-        <w:t>prioritized by descending frequency of occurrence and</w:t>
-      </w:r>
-      <w:r>
-        <w:t xml:space="preserve"> export the results to a file.</w:t>
+        <w:t>usagi_import table using pgadmin client import functionality</w:t>
       </w:r>
     </w:p>
     <w:p>
@@ -2138,7 +1995,7 @@
           <w:szCs w:val="19"/>
           <w:lang w:eastAsia="en-US"/>
         </w:rPr>
-        <w:t>E</w:t>
+        <w:t>R</w:t>
       </w:r>
       <w:r>
         <w:rPr>
@@ -2148,7 +2005,7 @@
           <w:szCs w:val="19"/>
           <w:lang w:eastAsia="en-US"/>
         </w:rPr>
-        <w:t xml:space="preserve">xport </w:t>
+        <w:t xml:space="preserve">un </w:t>
       </w:r>
       <w:r>
         <w:rPr>
@@ -2168,258 +2025,22 @@
           <w:szCs w:val="19"/>
           <w:lang w:eastAsia="en-US"/>
         </w:rPr>
-        <w:t xml:space="preserve">mapped codes from </w:t>
-      </w:r>
-      <w:r>
-        <w:rPr>
-          <w:rFonts w:ascii="Arial" w:eastAsia="Times New Roman" w:hAnsi="Arial" w:cs="Arial"/>
-          <w:color w:val="222222"/>
-          <w:sz w:val="19"/>
-          <w:szCs w:val="19"/>
-          <w:lang w:eastAsia="en-US"/>
-        </w:rPr>
-        <w:t>USAGI</w:t>
-      </w:r>
-      <w:r>
-        <w:rPr>
-          <w:rFonts w:ascii="Arial" w:eastAsia="Times New Roman" w:hAnsi="Arial" w:cs="Arial"/>
-          <w:color w:val="222222"/>
-          <w:sz w:val="19"/>
-          <w:szCs w:val="19"/>
-          <w:lang w:eastAsia="en-US"/>
-        </w:rPr>
-        <w:t xml:space="preserve"> to a file</w:t>
-      </w:r>
-      <w:r>
-        <w:rPr>
-          <w:rFonts w:ascii="Arial" w:eastAsia="Times New Roman" w:hAnsi="Arial" w:cs="Arial"/>
-          <w:color w:val="222222"/>
-          <w:sz w:val="19"/>
-          <w:szCs w:val="19"/>
-          <w:lang w:eastAsia="en-US"/>
-        </w:rPr>
-        <w:t>.</w:t>
-      </w:r>
-    </w:p>
-    <w:p>
-      <w:pPr>
-        <w:pStyle w:val="ListParagraph"/>
-        <w:widowControl/>
+        <w:t>load_drug_usagi_mapping.sql SQL script to populate the drug_usagi_mapping table</w:t>
+      </w:r>
+    </w:p>
+    <w:p>
+      <w:pPr>
+        <w:tabs>
+          <w:tab w:val="left" w:pos="425"/>
+        </w:tabs>
+      </w:pPr>
+    </w:p>
+    <w:p>
+      <w:pPr>
         <w:numPr>
           <w:ilvl w:val="0"/>
           <w:numId w:val="10"/>
         </w:numPr>
-        <w:shd w:val="clear" w:color="auto" w:fill="FFFFFF"/>
-        <w:suppressAutoHyphens w:val="0"/>
-        <w:rPr>
-          <w:rFonts w:ascii="Arial" w:eastAsia="Times New Roman" w:hAnsi="Arial" w:cs="Arial"/>
-          <w:color w:val="222222"/>
-          <w:sz w:val="19"/>
-          <w:szCs w:val="19"/>
-          <w:lang w:eastAsia="en-US"/>
-        </w:rPr>
-      </w:pPr>
-      <w:r>
-        <w:rPr>
-          <w:rFonts w:ascii="Arial" w:eastAsia="Times New Roman" w:hAnsi="Arial" w:cs="Arial"/>
-          <w:color w:val="222222"/>
-          <w:sz w:val="19"/>
-          <w:szCs w:val="19"/>
-          <w:lang w:eastAsia="en-US"/>
-        </w:rPr>
-        <w:t>L</w:t>
-      </w:r>
-      <w:r>
-        <w:rPr>
-          <w:rFonts w:ascii="Arial" w:eastAsia="Times New Roman" w:hAnsi="Arial" w:cs="Arial"/>
-          <w:color w:val="222222"/>
-          <w:sz w:val="19"/>
-          <w:szCs w:val="19"/>
-          <w:lang w:eastAsia="en-US"/>
-        </w:rPr>
-        <w:t xml:space="preserve">oad </w:t>
-      </w:r>
-      <w:r>
-        <w:rPr>
-          <w:rFonts w:ascii="Arial" w:eastAsia="Times New Roman" w:hAnsi="Arial" w:cs="Arial"/>
-          <w:color w:val="222222"/>
-          <w:sz w:val="19"/>
-          <w:szCs w:val="19"/>
-          <w:lang w:eastAsia="en-US"/>
-        </w:rPr>
-        <w:t>the USAGI</w:t>
-      </w:r>
-      <w:r>
-        <w:rPr>
-          <w:rFonts w:ascii="Arial" w:eastAsia="Times New Roman" w:hAnsi="Arial" w:cs="Arial"/>
-          <w:color w:val="222222"/>
-          <w:sz w:val="19"/>
-          <w:szCs w:val="19"/>
-          <w:lang w:eastAsia="en-US"/>
-        </w:rPr>
-        <w:t xml:space="preserve"> mapped codes file into </w:t>
-      </w:r>
-      <w:r>
-        <w:rPr>
-          <w:rFonts w:ascii="Arial" w:eastAsia="Times New Roman" w:hAnsi="Arial" w:cs="Arial"/>
-          <w:color w:val="222222"/>
-          <w:sz w:val="19"/>
-          <w:szCs w:val="19"/>
-          <w:lang w:eastAsia="en-US"/>
-        </w:rPr>
-        <w:t xml:space="preserve">the </w:t>
-      </w:r>
-      <w:proofErr w:type="spellStart"/>
-      <w:r>
-        <w:rPr>
-          <w:rFonts w:ascii="Arial" w:eastAsia="Times New Roman" w:hAnsi="Arial" w:cs="Arial"/>
-          <w:color w:val="222222"/>
-          <w:sz w:val="19"/>
-          <w:szCs w:val="19"/>
-          <w:lang w:eastAsia="en-US"/>
-        </w:rPr>
-        <w:t>usagi_import</w:t>
-      </w:r>
-      <w:proofErr w:type="spellEnd"/>
-      <w:r>
-        <w:rPr>
-          <w:rFonts w:ascii="Arial" w:eastAsia="Times New Roman" w:hAnsi="Arial" w:cs="Arial"/>
-          <w:color w:val="222222"/>
-          <w:sz w:val="19"/>
-          <w:szCs w:val="19"/>
-          <w:lang w:eastAsia="en-US"/>
-        </w:rPr>
-        <w:t xml:space="preserve"> table using </w:t>
-      </w:r>
-      <w:proofErr w:type="spellStart"/>
-      <w:r>
-        <w:rPr>
-          <w:rFonts w:ascii="Arial" w:eastAsia="Times New Roman" w:hAnsi="Arial" w:cs="Arial"/>
-          <w:color w:val="222222"/>
-          <w:sz w:val="19"/>
-          <w:szCs w:val="19"/>
-          <w:lang w:eastAsia="en-US"/>
-        </w:rPr>
-        <w:t>pgadmin</w:t>
-      </w:r>
-      <w:proofErr w:type="spellEnd"/>
-      <w:r>
-        <w:rPr>
-          <w:rFonts w:ascii="Arial" w:eastAsia="Times New Roman" w:hAnsi="Arial" w:cs="Arial"/>
-          <w:color w:val="222222"/>
-          <w:sz w:val="19"/>
-          <w:szCs w:val="19"/>
-          <w:lang w:eastAsia="en-US"/>
-        </w:rPr>
-        <w:t xml:space="preserve"> client import functionality</w:t>
-      </w:r>
-    </w:p>
-    <w:p>
-      <w:pPr>
-        <w:pStyle w:val="ListParagraph"/>
-        <w:widowControl/>
-        <w:numPr>
-          <w:ilvl w:val="0"/>
-          <w:numId w:val="10"/>
-        </w:numPr>
-        <w:shd w:val="clear" w:color="auto" w:fill="FFFFFF"/>
-        <w:suppressAutoHyphens w:val="0"/>
-        <w:rPr>
-          <w:rFonts w:ascii="Arial" w:eastAsia="Times New Roman" w:hAnsi="Arial" w:cs="Arial"/>
-          <w:color w:val="222222"/>
-          <w:sz w:val="19"/>
-          <w:szCs w:val="19"/>
-          <w:lang w:eastAsia="en-US"/>
-        </w:rPr>
-      </w:pPr>
-      <w:r>
-        <w:rPr>
-          <w:rFonts w:ascii="Arial" w:eastAsia="Times New Roman" w:hAnsi="Arial" w:cs="Arial"/>
-          <w:color w:val="222222"/>
-          <w:sz w:val="19"/>
-          <w:szCs w:val="19"/>
-          <w:lang w:eastAsia="en-US"/>
-        </w:rPr>
-        <w:t>R</w:t>
-      </w:r>
-      <w:r>
-        <w:rPr>
-          <w:rFonts w:ascii="Arial" w:eastAsia="Times New Roman" w:hAnsi="Arial" w:cs="Arial"/>
-          <w:color w:val="222222"/>
-          <w:sz w:val="19"/>
-          <w:szCs w:val="19"/>
-          <w:lang w:eastAsia="en-US"/>
-        </w:rPr>
-        <w:t xml:space="preserve">un </w:t>
-      </w:r>
-      <w:r>
-        <w:rPr>
-          <w:rFonts w:ascii="Arial" w:eastAsia="Times New Roman" w:hAnsi="Arial" w:cs="Arial"/>
-          <w:color w:val="222222"/>
-          <w:sz w:val="19"/>
-          <w:szCs w:val="19"/>
-          <w:lang w:eastAsia="en-US"/>
-        </w:rPr>
-        <w:t xml:space="preserve">the </w:t>
-      </w:r>
-      <w:proofErr w:type="spellStart"/>
-      <w:r>
-        <w:rPr>
-          <w:rFonts w:ascii="Arial" w:eastAsia="Times New Roman" w:hAnsi="Arial" w:cs="Arial"/>
-          <w:color w:val="222222"/>
-          <w:sz w:val="19"/>
-          <w:szCs w:val="19"/>
-          <w:lang w:eastAsia="en-US"/>
-        </w:rPr>
-        <w:t>load_drug_usagi_mapping.sql</w:t>
-      </w:r>
-      <w:proofErr w:type="spellEnd"/>
-      <w:r>
-        <w:rPr>
-          <w:rFonts w:ascii="Arial" w:eastAsia="Times New Roman" w:hAnsi="Arial" w:cs="Arial"/>
-          <w:color w:val="222222"/>
-          <w:sz w:val="19"/>
-          <w:szCs w:val="19"/>
-          <w:lang w:eastAsia="en-US"/>
-        </w:rPr>
-        <w:t xml:space="preserve"> SQL script to populate the </w:t>
-      </w:r>
-      <w:proofErr w:type="spellStart"/>
-      <w:r>
-        <w:rPr>
-          <w:rFonts w:ascii="Arial" w:eastAsia="Times New Roman" w:hAnsi="Arial" w:cs="Arial"/>
-          <w:color w:val="222222"/>
-          <w:sz w:val="19"/>
-          <w:szCs w:val="19"/>
-          <w:lang w:eastAsia="en-US"/>
-        </w:rPr>
-        <w:t>drug_usagi_mapping</w:t>
-      </w:r>
-      <w:proofErr w:type="spellEnd"/>
-      <w:r>
-        <w:rPr>
-          <w:rFonts w:ascii="Arial" w:eastAsia="Times New Roman" w:hAnsi="Arial" w:cs="Arial"/>
-          <w:color w:val="222222"/>
-          <w:sz w:val="19"/>
-          <w:szCs w:val="19"/>
-          <w:lang w:eastAsia="en-US"/>
-        </w:rPr>
-        <w:t xml:space="preserve"> table</w:t>
-      </w:r>
-    </w:p>
-    <w:p>
-      <w:pPr>
-        <w:tabs>
-          <w:tab w:val="left" w:pos="425"/>
-        </w:tabs>
-      </w:pPr>
-    </w:p>
-    <w:p>
-      <w:pPr>
-        <w:numPr>
-          <w:ilvl w:val="0"/>
-          <w:numId w:val="10"/>
-        </w:numPr>
         <w:tabs>
           <w:tab w:val="left" w:pos="425"/>
         </w:tabs>
@@ -2430,7 +2051,6 @@
       <w:r>
         <w:t xml:space="preserve">The USAGI section of the </w:t>
       </w:r>
-      <w:proofErr w:type="spellStart"/>
       <w:r>
         <w:rPr>
           <w:b/>
@@ -2438,74 +2058,17 @@
         </w:rPr>
         <w:t>map_all_drug_name_to_rxnorm.sql</w:t>
       </w:r>
-      <w:proofErr w:type="spellEnd"/>
       <w:r>
         <w:t xml:space="preserve"> script SQL script will </w:t>
       </w:r>
       <w:r>
-        <w:t xml:space="preserve">set the </w:t>
-      </w:r>
-      <w:proofErr w:type="spellStart"/>
-      <w:r>
-        <w:t>combined_drug_mapping</w:t>
-      </w:r>
-      <w:proofErr w:type="spellEnd"/>
-      <w:r>
-        <w:t xml:space="preserve"> table </w:t>
-      </w:r>
-      <w:proofErr w:type="spellStart"/>
-      <w:r>
-        <w:t>update_type</w:t>
-      </w:r>
-      <w:proofErr w:type="spellEnd"/>
-      <w:r>
-        <w:t xml:space="preserve"> column to '</w:t>
-      </w:r>
-      <w:proofErr w:type="spellStart"/>
-      <w:r>
-        <w:t>us</w:t>
-      </w:r>
-      <w:r>
-        <w:t>agi</w:t>
-      </w:r>
-      <w:proofErr w:type="spellEnd"/>
-      <w:r>
-        <w:t xml:space="preserve">' and the </w:t>
-      </w:r>
-      <w:proofErr w:type="spellStart"/>
-      <w:r>
-        <w:t>concept_id</w:t>
-      </w:r>
-      <w:proofErr w:type="spellEnd"/>
-      <w:r>
-        <w:t xml:space="preserve"> to the </w:t>
-      </w:r>
-      <w:r>
-        <w:t>matching (</w:t>
-      </w:r>
-      <w:proofErr w:type="spellStart"/>
-      <w:r>
-        <w:t>RxNorm</w:t>
-      </w:r>
-      <w:proofErr w:type="spellEnd"/>
-      <w:r>
-        <w:t xml:space="preserve">) </w:t>
-      </w:r>
-      <w:proofErr w:type="spellStart"/>
-      <w:r>
-        <w:t>concept_id</w:t>
-      </w:r>
-      <w:proofErr w:type="spellEnd"/>
-      <w:r>
-        <w:t xml:space="preserve"> in the </w:t>
-      </w:r>
-      <w:proofErr w:type="spellStart"/>
-      <w:r>
-        <w:t>drug_usagi_mapping</w:t>
-      </w:r>
-      <w:proofErr w:type="spellEnd"/>
-      <w:r>
-        <w:t xml:space="preserve"> table.</w:t>
+        <w:t>set the combined_drug_mapping table update_type column to 'us</w:t>
+      </w:r>
+      <w:r>
+        <w:t xml:space="preserve">agi' and the concept_id to the </w:t>
+      </w:r>
+      <w:r>
+        <w:t>matching (RxNorm) concept_id in the drug_usagi_mapping table.</w:t>
       </w:r>
     </w:p>
     <w:p>
@@ -2538,53 +2101,13 @@
         </w:numPr>
       </w:pPr>
       <w:r>
-        <w:t xml:space="preserve">Standardize </w:t>
-      </w:r>
-      <w:proofErr w:type="spellStart"/>
-      <w:r>
-        <w:t>RxNorm</w:t>
-      </w:r>
-      <w:proofErr w:type="spellEnd"/>
-      <w:r>
-        <w:t xml:space="preserve"> concepts to standard </w:t>
-      </w:r>
-      <w:proofErr w:type="spellStart"/>
-      <w:r>
-        <w:t>RxNorm</w:t>
-      </w:r>
-      <w:proofErr w:type="spellEnd"/>
-      <w:r>
-        <w:t xml:space="preserve"> concepts of Ingredient or Clinical Drug Form</w:t>
+        <w:t>Standardize RxNorm concepts to standard RxNorm concepts of Ingredient or Clinical Drug Form</w:t>
       </w:r>
     </w:p>
     <w:p/>
     <w:p>
       <w:r>
-        <w:t xml:space="preserve">The aim of this section of the process is to create a </w:t>
-      </w:r>
-      <w:proofErr w:type="spellStart"/>
-      <w:r>
-        <w:t>standard_drug</w:t>
-      </w:r>
-      <w:proofErr w:type="spellEnd"/>
-      <w:r>
-        <w:t xml:space="preserve"> table with the original drug name and the associated standard </w:t>
-      </w:r>
-      <w:proofErr w:type="spellStart"/>
-      <w:r>
-        <w:t>RxNorm</w:t>
-      </w:r>
-      <w:proofErr w:type="spellEnd"/>
-      <w:r>
-        <w:t xml:space="preserve"> </w:t>
-      </w:r>
-      <w:proofErr w:type="spellStart"/>
-      <w:r>
-        <w:t>concept_id</w:t>
-      </w:r>
-      <w:proofErr w:type="spellEnd"/>
-      <w:r>
-        <w:t xml:space="preserve">.  </w:t>
+        <w:t xml:space="preserve">The aim of this section of the process is to create a standard_drug table with the original drug name and the associated standard RxNorm concept_id.  </w:t>
       </w:r>
     </w:p>
     <w:p/>
@@ -2601,7 +2124,6 @@
       <w:r>
         <w:t xml:space="preserve">Run the </w:t>
       </w:r>
-      <w:proofErr w:type="spellStart"/>
       <w:r>
         <w:rPr>
           <w:b/>
@@ -2609,7 +2131,6 @@
         </w:rPr>
         <w:t>standardize_combined_drug_mapping.sql</w:t>
       </w:r>
-      <w:proofErr w:type="spellEnd"/>
       <w:r>
         <w:t xml:space="preserve"> script    </w:t>
       </w:r>
@@ -2657,23 +2178,7 @@
     <w:p/>
     <w:p>
       <w:r>
-        <w:t xml:space="preserve">Derive the high level FAERS outcome categories (death, disability </w:t>
-      </w:r>
-      <w:proofErr w:type="spellStart"/>
-      <w:r>
-        <w:t>etc</w:t>
-      </w:r>
-      <w:proofErr w:type="spellEnd"/>
-      <w:r>
-        <w:t xml:space="preserve">) for the current data </w:t>
-      </w:r>
-      <w:proofErr w:type="spellStart"/>
-      <w:r>
-        <w:t>standard_drug</w:t>
-      </w:r>
-      <w:proofErr w:type="spellEnd"/>
-      <w:r>
-        <w:t xml:space="preserve"> table </w:t>
+        <w:t xml:space="preserve">Derive the high level FAERS outcome categories (death, disability etc) for the current data standard_drug table </w:t>
       </w:r>
     </w:p>
     <w:p/>
@@ -2688,11 +2193,7 @@
         </w:tabs>
       </w:pPr>
       <w:r>
-        <w:t xml:space="preserve">Run the </w:t>
-      </w:r>
-      <w:proofErr w:type="spellStart"/>
-      <w:r>
-        <w:t>d</w:t>
+        <w:t>Run the d</w:t>
       </w:r>
       <w:r>
         <w:rPr>
@@ -2701,7 +2202,6 @@
         </w:rPr>
         <w:t>erive_standard_case_outcome_category.sql</w:t>
       </w:r>
-      <w:proofErr w:type="spellEnd"/>
       <w:r>
         <w:t xml:space="preserve"> script </w:t>
       </w:r>
@@ -2729,29 +2229,8 @@
         </w:numPr>
       </w:pPr>
       <w:r>
-        <w:t xml:space="preserve">Derive standard drug indication from </w:t>
-      </w:r>
-      <w:proofErr w:type="spellStart"/>
-      <w:r>
-        <w:t>MedDRA</w:t>
-      </w:r>
-      <w:proofErr w:type="spellEnd"/>
-      <w:r>
-        <w:t xml:space="preserve"> preferred term to </w:t>
-      </w:r>
-      <w:proofErr w:type="spellStart"/>
-      <w:r>
-        <w:t>MedDRA</w:t>
-      </w:r>
-      <w:proofErr w:type="spellEnd"/>
-      <w:r>
-        <w:t xml:space="preserve"> </w:t>
-      </w:r>
-      <w:proofErr w:type="spellStart"/>
-      <w:r>
-        <w:t>concept_id</w:t>
-      </w:r>
-      <w:proofErr w:type="spellEnd"/>
+        <w:t>Derive standard drug indication from MedDRA preferred term to MedDRA concept_id</w:t>
+      </w:r>
     </w:p>
     <w:p/>
     <w:p>
@@ -2761,39 +2240,7 @@
         </w:tabs>
       </w:pPr>
       <w:r>
-        <w:t xml:space="preserve">Convert the FAERS indication </w:t>
-      </w:r>
-      <w:proofErr w:type="spellStart"/>
-      <w:r>
-        <w:t>MedDRA</w:t>
-      </w:r>
-      <w:proofErr w:type="spellEnd"/>
-      <w:r>
-        <w:t xml:space="preserve"> preferred terms into </w:t>
-      </w:r>
-      <w:proofErr w:type="spellStart"/>
-      <w:r>
-        <w:t>MedDRA</w:t>
-      </w:r>
-      <w:proofErr w:type="spellEnd"/>
-      <w:r>
-        <w:t xml:space="preserve"> concept ids (limited to the cases in the </w:t>
-      </w:r>
-      <w:proofErr w:type="spellStart"/>
-      <w:r>
-        <w:t>unique_all_case</w:t>
-      </w:r>
-      <w:proofErr w:type="spellEnd"/>
-      <w:r>
-        <w:t xml:space="preserve"> table) in a new table called </w:t>
-      </w:r>
-      <w:proofErr w:type="spellStart"/>
-      <w:r>
-        <w:t>standard_case_indication</w:t>
-      </w:r>
-      <w:proofErr w:type="spellEnd"/>
-      <w:r>
-        <w:t xml:space="preserve">. </w:t>
+        <w:t xml:space="preserve">Convert the FAERS indication MedDRA preferred terms into MedDRA concept ids (limited to the cases in the unique_all_case table) in a new table called standard_case_indication. </w:t>
       </w:r>
     </w:p>
     <w:p/>
@@ -2810,28 +2257,77 @@
       <w:r>
         <w:t xml:space="preserve">Run the </w:t>
       </w:r>
-      <w:proofErr w:type="spellStart"/>
       <w:r>
         <w:rPr>
           <w:b/>
           <w:bCs/>
         </w:rPr>
-        <w:t>derive_standard_case_indication.sql</w:t>
-      </w:r>
-      <w:proofErr w:type="spellEnd"/>
+        <w:t xml:space="preserve">derive_standard_case_indication.sql </w:t>
+      </w:r>
+      <w:r>
+        <w:t xml:space="preserve">script </w:t>
+      </w:r>
+      <w:r>
+        <w:tab/>
+      </w:r>
+    </w:p>
+    <w:p>
+      <w:pPr>
+        <w:pStyle w:val="Heading21"/>
+        <w:numPr>
+          <w:ilvl w:val="1"/>
+          <w:numId w:val="1"/>
+        </w:numPr>
+      </w:pPr>
+      <w:r>
+        <w:t>Derive standard case outcome (FAERS reaction) from MedDRA preferred term to MedDRA concept_id</w:t>
+      </w:r>
+    </w:p>
+    <w:p/>
+    <w:p>
+      <w:pPr>
+        <w:tabs>
+          <w:tab w:val="left" w:pos="425"/>
+        </w:tabs>
+      </w:pPr>
+      <w:r>
+        <w:t xml:space="preserve">Convert the FAERS reactions (adverse event outcomes) MedDRA preferred terms into MedDRA concept ids (limited to the cases in the unique_all_case table) in a new table called standard_case_outcome. </w:t>
+      </w:r>
+    </w:p>
+    <w:p/>
+    <w:p>
+      <w:pPr>
+        <w:numPr>
+          <w:ilvl w:val="0"/>
+          <w:numId w:val="7"/>
+        </w:numPr>
+        <w:tabs>
+          <w:tab w:val="left" w:pos="425"/>
+        </w:tabs>
+      </w:pPr>
+      <w:r>
+        <w:t xml:space="preserve">Run the </w:t>
+      </w:r>
       <w:r>
         <w:rPr>
           <w:b/>
           <w:bCs/>
         </w:rPr>
-        <w:t xml:space="preserve"> </w:t>
-      </w:r>
-      <w:r>
-        <w:t xml:space="preserve">script </w:t>
+        <w:t>derive_standard_case_outcome.sql</w:t>
+      </w:r>
+      <w:r>
+        <w:t xml:space="preserve"> script </w:t>
       </w:r>
       <w:r>
         <w:tab/>
       </w:r>
+    </w:p>
+    <w:p>
+      <w:pPr>
+        <w:tabs>
+          <w:tab w:val="left" w:pos="425"/>
+        </w:tabs>
+      </w:pPr>
     </w:p>
     <w:p>
       <w:pPr>
@@ -2842,29 +2338,8 @@
         </w:numPr>
       </w:pPr>
       <w:r>
-        <w:t xml:space="preserve">Derive standard case outcome (FAERS reaction) from </w:t>
-      </w:r>
-      <w:proofErr w:type="spellStart"/>
-      <w:r>
-        <w:t>MedDRA</w:t>
-      </w:r>
-      <w:proofErr w:type="spellEnd"/>
-      <w:r>
-        <w:t xml:space="preserve"> preferred term to </w:t>
-      </w:r>
-      <w:proofErr w:type="spellStart"/>
-      <w:r>
-        <w:t>MedDRA</w:t>
-      </w:r>
-      <w:proofErr w:type="spellEnd"/>
-      <w:r>
-        <w:t xml:space="preserve"> </w:t>
-      </w:r>
-      <w:proofErr w:type="spellStart"/>
-      <w:r>
-        <w:t>concept_id</w:t>
-      </w:r>
-      <w:proofErr w:type="spellEnd"/>
+        <w:t xml:space="preserve">Derive standard drug outcome (FAERS reaction) counts </w:t>
+      </w:r>
     </w:p>
     <w:p/>
     <w:p>
@@ -2874,39 +2349,7 @@
         </w:tabs>
       </w:pPr>
       <w:r>
-        <w:t xml:space="preserve">Convert the FAERS reactions (adverse event outcomes) </w:t>
-      </w:r>
-      <w:proofErr w:type="spellStart"/>
-      <w:r>
-        <w:t>MedDRA</w:t>
-      </w:r>
-      <w:proofErr w:type="spellEnd"/>
-      <w:r>
-        <w:t xml:space="preserve"> preferred terms into </w:t>
-      </w:r>
-      <w:proofErr w:type="spellStart"/>
-      <w:r>
-        <w:t>MedDRA</w:t>
-      </w:r>
-      <w:proofErr w:type="spellEnd"/>
-      <w:r>
-        <w:t xml:space="preserve"> concept ids (limited to the cases in the </w:t>
-      </w:r>
-      <w:proofErr w:type="spellStart"/>
-      <w:r>
-        <w:t>unique_all_case</w:t>
-      </w:r>
-      <w:proofErr w:type="spellEnd"/>
-      <w:r>
-        <w:t xml:space="preserve"> table) in a new table called </w:t>
-      </w:r>
-      <w:proofErr w:type="spellStart"/>
-      <w:r>
-        <w:t>standard_case_outcome</w:t>
-      </w:r>
-      <w:proofErr w:type="spellEnd"/>
-      <w:r>
-        <w:t xml:space="preserve">. </w:t>
+        <w:t>Create drug/outcome combination counts (counts for pairs of drug RxNorm concept_id, outcome (reaction) MedDRA concept_id) and store the counts in a new table called standard_drug_outcome_count</w:t>
       </w:r>
     </w:p>
     <w:p/>
@@ -2923,21 +2366,23 @@
       <w:r>
         <w:t xml:space="preserve">Run the </w:t>
       </w:r>
-      <w:proofErr w:type="spellStart"/>
       <w:r>
         <w:rPr>
           <w:b/>
           <w:bCs/>
         </w:rPr>
-        <w:t>derive_standard_case_outcome.sql</w:t>
-      </w:r>
-      <w:proofErr w:type="spellEnd"/>
+        <w:t>derive_standard_drug_outcome_count.sql</w:t>
+      </w:r>
       <w:r>
         <w:t xml:space="preserve"> script </w:t>
       </w:r>
-      <w:r>
-        <w:tab/>
-      </w:r>
+    </w:p>
+    <w:p>
+      <w:pPr>
+        <w:tabs>
+          <w:tab w:val="left" w:pos="425"/>
+        </w:tabs>
+      </w:pPr>
     </w:p>
     <w:p>
       <w:pPr>
@@ -2955,7 +2400,7 @@
         </w:numPr>
       </w:pPr>
       <w:r>
-        <w:t xml:space="preserve">Derive standard drug outcome (FAERS reaction) counts </w:t>
+        <w:t>Derive standard drug outcome (FAERS reaction) 2x2 contingency tables</w:t>
       </w:r>
     </w:p>
     <w:p/>
@@ -2966,45 +2411,8 @@
         </w:tabs>
       </w:pPr>
       <w:r>
-        <w:t xml:space="preserve">Create drug/outcome combination counts (counts for pairs of drug </w:t>
-      </w:r>
-      <w:proofErr w:type="spellStart"/>
-      <w:r>
-        <w:t>RxNorm</w:t>
-      </w:r>
-      <w:proofErr w:type="spellEnd"/>
-      <w:r>
-        <w:t xml:space="preserve"> </w:t>
-      </w:r>
-      <w:proofErr w:type="spellStart"/>
-      <w:r>
-        <w:t>concept_id</w:t>
-      </w:r>
-      <w:proofErr w:type="spellEnd"/>
-      <w:r>
-        <w:t xml:space="preserve">, outcome (reaction) </w:t>
-      </w:r>
-      <w:proofErr w:type="spellStart"/>
-      <w:r>
-        <w:t>MedDRA</w:t>
-      </w:r>
-      <w:proofErr w:type="spellEnd"/>
-      <w:r>
-        <w:t xml:space="preserve"> </w:t>
-      </w:r>
-      <w:proofErr w:type="spellStart"/>
-      <w:r>
-        <w:t>concept_id</w:t>
-      </w:r>
-      <w:proofErr w:type="spellEnd"/>
-      <w:r>
-        <w:t xml:space="preserve">) and store the counts in a new table called </w:t>
-      </w:r>
-      <w:proofErr w:type="spellStart"/>
-      <w:r>
-        <w:t>standard_drug_outcome_count</w:t>
-      </w:r>
-      <w:proofErr w:type="spellEnd"/>
+        <w:t>Compute the 2x2 contingency table for each drug/outcome pari  in a new table called standard_drug_outcome_contingency_table</w:t>
+      </w:r>
     </w:p>
     <w:p/>
     <w:p>
@@ -3020,31 +2428,27 @@
       <w:r>
         <w:t xml:space="preserve">Run the </w:t>
       </w:r>
-      <w:proofErr w:type="spellStart"/>
       <w:r>
         <w:rPr>
           <w:b/>
           <w:bCs/>
         </w:rPr>
-        <w:t>derive_standard_drug_outcome_count.sql</w:t>
-      </w:r>
-      <w:proofErr w:type="spellEnd"/>
-      <w:r>
-        <w:t xml:space="preserve"> script </w:t>
-      </w:r>
-    </w:p>
-    <w:p>
-      <w:pPr>
-        <w:tabs>
-          <w:tab w:val="left" w:pos="425"/>
-        </w:tabs>
-      </w:pPr>
-    </w:p>
-    <w:p>
-      <w:pPr>
-        <w:tabs>
-          <w:tab w:val="left" w:pos="425"/>
-        </w:tabs>
+        <w:t>derive_standard_drug_outcome_contingency_table.sql</w:t>
+      </w:r>
+      <w:r>
+        <w:t xml:space="preserve"> script  (Note, the run-time is around 6 hours)</w:t>
+      </w:r>
+    </w:p>
+    <w:p>
+      <w:pPr>
+        <w:tabs>
+          <w:tab w:val="left" w:pos="425"/>
+        </w:tabs>
+      </w:pPr>
+    </w:p>
+    <w:p>
+      <w:pPr>
+        <w:pStyle w:val="Heading21"/>
       </w:pPr>
     </w:p>
     <w:p>
@@ -3056,7 +2460,7 @@
         </w:numPr>
       </w:pPr>
       <w:r>
-        <w:t>Derive standard drug outcome (FAERS reaction) 2x2 contingency tables</w:t>
+        <w:t xml:space="preserve">Derive standard drug outcome (FAERS reaction) statistics </w:t>
       </w:r>
     </w:p>
     <w:p/>
@@ -3067,26 +2471,8 @@
         </w:tabs>
       </w:pPr>
       <w:r>
-        <w:t xml:space="preserve">Compute the 2x2 contingency table for each drug/outcome </w:t>
-      </w:r>
-      <w:proofErr w:type="spellStart"/>
-      <w:proofErr w:type="gramStart"/>
-      <w:r>
-        <w:t>pari</w:t>
-      </w:r>
-      <w:proofErr w:type="spellEnd"/>
-      <w:r>
-        <w:t xml:space="preserve">  in</w:t>
-      </w:r>
-      <w:proofErr w:type="gramEnd"/>
-      <w:r>
-        <w:t xml:space="preserve"> a new table called </w:t>
-      </w:r>
-      <w:proofErr w:type="spellStart"/>
-      <w:r>
-        <w:t>standard_drug_outcome_contingency_table</w:t>
-      </w:r>
-      <w:proofErr w:type="spellEnd"/>
+        <w:t>Compute the PRR, ROR and associated 95% CI limit statistics in a new table called standard_drug_outcome_statistics</w:t>
+      </w:r>
     </w:p>
     <w:p/>
     <w:p>
@@ -3102,68 +2488,34 @@
       <w:r>
         <w:t xml:space="preserve">Run the </w:t>
       </w:r>
-      <w:proofErr w:type="spellStart"/>
       <w:r>
         <w:rPr>
           <w:b/>
           <w:bCs/>
         </w:rPr>
-        <w:t>derive_standard_drug_outcome_contingency_table.sql</w:t>
-      </w:r>
-      <w:proofErr w:type="spellEnd"/>
-      <w:r>
-        <w:t xml:space="preserve"> </w:t>
-      </w:r>
-      <w:proofErr w:type="gramStart"/>
-      <w:r>
-        <w:t>script  (</w:t>
-      </w:r>
-      <w:proofErr w:type="gramEnd"/>
-      <w:r>
-        <w:t>Note, the run-time is around 6 hours)</w:t>
-      </w:r>
-    </w:p>
-    <w:p>
-      <w:pPr>
-        <w:tabs>
-          <w:tab w:val="left" w:pos="425"/>
-        </w:tabs>
-      </w:pPr>
+        <w:t>derive_standard_drug_outcome_statistics.sql</w:t>
+      </w:r>
+      <w:r>
+        <w:t xml:space="preserve"> script. </w:t>
+      </w:r>
     </w:p>
     <w:p>
       <w:pPr>
         <w:pStyle w:val="Heading21"/>
       </w:pPr>
-    </w:p>
-    <w:p>
-      <w:pPr>
-        <w:pStyle w:val="Heading21"/>
-        <w:numPr>
-          <w:ilvl w:val="1"/>
-          <w:numId w:val="1"/>
-        </w:numPr>
-      </w:pPr>
-      <w:r>
-        <w:t xml:space="preserve">Derive standard drug outcome (FAERS reaction) statistics </w:t>
+      <w:r>
+        <w:t xml:space="preserve">Map MedDRA codes to SNOMED codes </w:t>
       </w:r>
     </w:p>
     <w:p/>
     <w:p>
-      <w:pPr>
-        <w:tabs>
-          <w:tab w:val="left" w:pos="425"/>
-        </w:tabs>
-      </w:pPr>
-      <w:r>
-        <w:t xml:space="preserve">Compute the PRR, ROR and associated 95% CI limit statistics in a new table called </w:t>
-      </w:r>
-      <w:proofErr w:type="spellStart"/>
-      <w:r>
-        <w:t>standard_drug_outcome_statistics</w:t>
-      </w:r>
-      <w:proofErr w:type="spellEnd"/>
-    </w:p>
-    <w:p/>
+      <w:r>
+        <w:t>M</w:t>
+      </w:r>
+      <w:r>
+        <w:t>ap drug indications and adverse event outcomes (FAERS reactions) and associated drug/outcome pair counts from MedDRA preferred terms to SNOMED-CT concepts</w:t>
+      </w:r>
+    </w:p>
     <w:p>
       <w:pPr>
         <w:numPr>
@@ -3177,140 +2529,56 @@
       <w:r>
         <w:t xml:space="preserve">Run the </w:t>
       </w:r>
-      <w:proofErr w:type="spellStart"/>
       <w:r>
         <w:rPr>
           <w:b/>
           <w:bCs/>
         </w:rPr>
-        <w:t>derive_standard_drug_out</w:t>
-      </w:r>
-      <w:bookmarkStart w:id="0" w:name="_GoBack"/>
-      <w:bookmarkEnd w:id="0"/>
+        <w:t>map_meddra_to_snomed.sql</w:t>
+      </w:r>
+      <w:r>
+        <w:t xml:space="preserve"> script. </w:t>
+      </w:r>
+    </w:p>
+    <w:p>
+      <w:pPr>
+        <w:pStyle w:val="Heading21"/>
+      </w:pPr>
+    </w:p>
+    <w:p>
+      <w:pPr>
+        <w:pStyle w:val="Heading21"/>
+      </w:pPr>
+      <w:r>
+        <w:t>Create standard drug outcome drill down table</w:t>
+      </w:r>
+    </w:p>
+    <w:p/>
+    <w:p>
+      <w:r>
+        <w:t>Create standard_drug_outcome_drilldown table for use in joins to get all cases for a drug/outcome pair count</w:t>
+      </w:r>
+    </w:p>
+    <w:p>
+      <w:pPr>
+        <w:numPr>
+          <w:ilvl w:val="0"/>
+          <w:numId w:val="7"/>
+        </w:numPr>
+        <w:tabs>
+          <w:tab w:val="left" w:pos="425"/>
+        </w:tabs>
+      </w:pPr>
+      <w:r>
+        <w:t xml:space="preserve">Run the </w:t>
+      </w:r>
       <w:r>
         <w:rPr>
           <w:b/>
           <w:bCs/>
         </w:rPr>
-        <w:t>come_statistics.sql</w:t>
-      </w:r>
-      <w:proofErr w:type="spellEnd"/>
-      <w:r>
-        <w:t xml:space="preserve"> script. </w:t>
-      </w:r>
-    </w:p>
-    <w:p>
-      <w:pPr>
-        <w:pStyle w:val="Heading21"/>
-      </w:pPr>
-      <w:r>
-        <w:lastRenderedPageBreak/>
-        <w:t xml:space="preserve">Map </w:t>
-      </w:r>
-      <w:proofErr w:type="spellStart"/>
-      <w:r>
-        <w:t>MedDRA</w:t>
-      </w:r>
-      <w:proofErr w:type="spellEnd"/>
-      <w:r>
-        <w:t xml:space="preserve"> codes to SNOMED codes</w:t>
-      </w:r>
-      <w:r>
-        <w:t xml:space="preserve"> </w:t>
-      </w:r>
-    </w:p>
-    <w:p/>
-    <w:p>
-      <w:r>
-        <w:t>M</w:t>
-      </w:r>
-      <w:r>
-        <w:t xml:space="preserve">ap drug indications and adverse event outcomes (FAERS reactions) and associated drug/outcome pair counts from </w:t>
-      </w:r>
-      <w:proofErr w:type="spellStart"/>
-      <w:r>
-        <w:t>MedDRA</w:t>
-      </w:r>
-      <w:proofErr w:type="spellEnd"/>
-      <w:r>
-        <w:t xml:space="preserve"> preferred terms to SNOMED-CT concepts</w:t>
-      </w:r>
-    </w:p>
-    <w:p>
-      <w:pPr>
-        <w:numPr>
-          <w:ilvl w:val="0"/>
-          <w:numId w:val="7"/>
-        </w:numPr>
-        <w:tabs>
-          <w:tab w:val="left" w:pos="425"/>
-        </w:tabs>
-      </w:pPr>
-      <w:r>
-        <w:t xml:space="preserve">Run the </w:t>
-      </w:r>
-      <w:proofErr w:type="spellStart"/>
-      <w:r>
-        <w:rPr>
-          <w:b/>
-          <w:bCs/>
-        </w:rPr>
-        <w:t>map_meddra_to_snomed.sql</w:t>
-      </w:r>
-      <w:proofErr w:type="spellEnd"/>
-      <w:r>
-        <w:t xml:space="preserve"> script. </w:t>
-      </w:r>
-    </w:p>
-    <w:p>
-      <w:pPr>
-        <w:pStyle w:val="Heading21"/>
-      </w:pPr>
-    </w:p>
-    <w:p>
-      <w:pPr>
-        <w:pStyle w:val="Heading21"/>
-      </w:pPr>
-      <w:r>
-        <w:t>Create standard drug outcome drill down table</w:t>
-      </w:r>
-    </w:p>
-    <w:p/>
-    <w:p>
-      <w:r>
-        <w:t xml:space="preserve">Create </w:t>
-      </w:r>
-      <w:proofErr w:type="spellStart"/>
-      <w:r>
-        <w:t>standard_drug_outcome_drilldown</w:t>
-      </w:r>
-      <w:proofErr w:type="spellEnd"/>
-      <w:r>
-        <w:t xml:space="preserve"> table for use in joins to get all cases for a drug/outcome pair count</w:t>
-      </w:r>
-    </w:p>
-    <w:p>
-      <w:pPr>
-        <w:numPr>
-          <w:ilvl w:val="0"/>
-          <w:numId w:val="7"/>
-        </w:numPr>
-        <w:tabs>
-          <w:tab w:val="left" w:pos="425"/>
-        </w:tabs>
-      </w:pPr>
-      <w:r>
-        <w:t xml:space="preserve">Run the </w:t>
-      </w:r>
-      <w:proofErr w:type="spellStart"/>
-      <w:r>
-        <w:rPr>
-          <w:b/>
-          <w:bCs/>
-        </w:rPr>
         <w:t>derive_standard_drug_outcome_drilldown.sql</w:t>
       </w:r>
-      <w:proofErr w:type="spellEnd"/>
       <w:r>
         <w:rPr>
           <w:b/>
@@ -3378,7 +2646,6 @@
       <w:r>
         <w:t xml:space="preserve">Run the </w:t>
       </w:r>
-      <w:proofErr w:type="spellStart"/>
       <w:r>
         <w:rPr>
           <w:b/>
@@ -3386,7 +2653,6 @@
         </w:rPr>
         <w:t>copy_tables_to_other_schemas.sql</w:t>
       </w:r>
-      <w:proofErr w:type="spellEnd"/>
       <w:r>
         <w:rPr>
           <w:b/>
@@ -3432,8 +2698,8 @@
 </file>
 
 <file path=word/numbering.xml><?xml version="1.0" encoding="utf-8"?>
-<w:numbering xmlns:wpc="http://schemas.microsoft.com/office/word/2010/wordprocessingCanvas" xmlns:mo="http://schemas.microsoft.com/office/mac/office/2008/main" xmlns:mc="http://schemas.openxmlformats.org/markup-compatibility/2006" xmlns:mv="urn:schemas-microsoft-com:mac:vml" xmlns:o="urn:schemas-microsoft-com:office:office" xmlns:r="http://schemas.openxmlformats.org/officeDocument/2006/relationships" xmlns:m="http://schemas.openxmlformats.org/officeDocument/2006/math" xmlns:v="urn:schemas-microsoft-com:vml" xmlns:wp14="http://schemas.microsoft.com/office/word/2010/wordprocessingDrawing" xmlns:wp="http://schemas.openxmlformats.org/drawingml/2006/wordprocessingDrawing" xmlns:w10="urn:schemas-microsoft-com:office:word" xmlns:w="http://schemas.openxmlformats.org/wordprocessingml/2006/main" xmlns:w14="http://schemas.microsoft.com/office/word/2010/wordml" xmlns:w15="http://schemas.microsoft.com/office/word/2012/wordml" xmlns:wpg="http://schemas.microsoft.com/office/word/2010/wordprocessingGroup" xmlns:wpi="http://schemas.microsoft.com/office/word/2010/wordprocessingInk" xmlns:wne="http://schemas.microsoft.com/office/word/2006/wordml" xmlns:wps="http://schemas.microsoft.com/office/word/2010/wordprocessingShape" mc:Ignorable="w14 w15 wp14">
-  <w:abstractNum w:abstractNumId="0">
+<w:numbering xmlns:wpc="http://schemas.microsoft.com/office/word/2010/wordprocessingCanvas" xmlns:cx="http://schemas.microsoft.com/office/drawing/2014/chartex" xmlns:cx1="http://schemas.microsoft.com/office/drawing/2015/9/8/chartex" xmlns:cx2="http://schemas.microsoft.com/office/drawing/2015/10/21/chartex" xmlns:cx3="http://schemas.microsoft.com/office/drawing/2016/5/9/chartex" xmlns:cx4="http://schemas.microsoft.com/office/drawing/2016/5/10/chartex" xmlns:cx5="http://schemas.microsoft.com/office/drawing/2016/5/11/chartex" xmlns:cx6="http://schemas.microsoft.com/office/drawing/2016/5/12/chartex" xmlns:cx7="http://schemas.microsoft.com/office/drawing/2016/5/13/chartex" xmlns:cx8="http://schemas.microsoft.com/office/drawing/2016/5/14/chartex" xmlns:mc="http://schemas.openxmlformats.org/markup-compatibility/2006" xmlns:aink="http://schemas.microsoft.com/office/drawing/2016/ink" xmlns:am3d="http://schemas.microsoft.com/office/drawing/2017/model3d" xmlns:o="urn:schemas-microsoft-com:office:office" xmlns:oel="http://schemas.microsoft.com/office/2019/extlst" xmlns:r="http://schemas.openxmlformats.org/officeDocument/2006/relationships" xmlns:m="http://schemas.openxmlformats.org/officeDocument/2006/math" xmlns:v="urn:schemas-microsoft-com:vml" xmlns:wp14="http://schemas.microsoft.com/office/word/2010/wordprocessingDrawing" xmlns:wp="http://schemas.openxmlformats.org/drawingml/2006/wordprocessingDrawing" xmlns:w10="urn:schemas-microsoft-com:office:word" xmlns:w="http://schemas.openxmlformats.org/wordprocessingml/2006/main" xmlns:w14="http://schemas.microsoft.com/office/word/2010/wordml" xmlns:w15="http://schemas.microsoft.com/office/word/2012/wordml" xmlns:w16cex="http://schemas.microsoft.com/office/word/2018/wordml/cex" xmlns:w16cid="http://schemas.microsoft.com/office/word/2016/wordml/cid" xmlns:w16="http://schemas.microsoft.com/office/word/2018/wordml" xmlns:w16du="http://schemas.microsoft.com/office/word/2023/wordml/word16du" xmlns:w16sdtdh="http://schemas.microsoft.com/office/word/2020/wordml/sdtdatahash" xmlns:w16sdtfl="http://schemas.microsoft.com/office/word/2024/wordml/sdtformatlock" xmlns:w16se="http://schemas.microsoft.com/office/word/2015/wordml/symex" xmlns:wpg="http://schemas.microsoft.com/office/word/2010/wordprocessingGroup" xmlns:wpi="http://schemas.microsoft.com/office/word/2010/wordprocessingInk" xmlns:wne="http://schemas.microsoft.com/office/word/2006/wordml" xmlns:wps="http://schemas.microsoft.com/office/word/2010/wordprocessingShape" mc:Ignorable="w14 w15 w16se w16cid w16 w16cex w16sdtdh w16sdtfl w16du wp14">
+  <w:abstractNum w:abstractNumId="0" w15:restartNumberingAfterBreak="0">
     <w:nsid w:val="0BA746B5"/>
     <w:multiLevelType w:val="multilevel"/>
     <w:tmpl w:val="AC944A44"/>
@@ -3573,7 +2839,7 @@
       </w:rPr>
     </w:lvl>
   </w:abstractNum>
-  <w:abstractNum w:abstractNumId="1">
+  <w:abstractNum w:abstractNumId="1" w15:restartNumberingAfterBreak="0">
     <w:nsid w:val="2432578A"/>
     <w:multiLevelType w:val="multilevel"/>
     <w:tmpl w:val="19B454E4"/>
@@ -3713,7 +2979,7 @@
       </w:rPr>
     </w:lvl>
   </w:abstractNum>
-  <w:abstractNum w:abstractNumId="2">
+  <w:abstractNum w:abstractNumId="2" w15:restartNumberingAfterBreak="0">
     <w:nsid w:val="44CD2BF6"/>
     <w:multiLevelType w:val="multilevel"/>
     <w:tmpl w:val="70F4D9CA"/>
@@ -3826,7 +3092,7 @@
       </w:pPr>
     </w:lvl>
   </w:abstractNum>
-  <w:abstractNum w:abstractNumId="3">
+  <w:abstractNum w:abstractNumId="3" w15:restartNumberingAfterBreak="0">
     <w:nsid w:val="45CF5ECA"/>
     <w:multiLevelType w:val="multilevel"/>
     <w:tmpl w:val="801A046E"/>
@@ -3966,7 +3232,7 @@
       </w:rPr>
     </w:lvl>
   </w:abstractNum>
-  <w:abstractNum w:abstractNumId="4">
+  <w:abstractNum w:abstractNumId="4" w15:restartNumberingAfterBreak="0">
     <w:nsid w:val="49FC1BDC"/>
     <w:multiLevelType w:val="multilevel"/>
     <w:tmpl w:val="D978660E"/>
@@ -4106,7 +3372,7 @@
       </w:rPr>
     </w:lvl>
   </w:abstractNum>
-  <w:abstractNum w:abstractNumId="5">
+  <w:abstractNum w:abstractNumId="5" w15:restartNumberingAfterBreak="0">
     <w:nsid w:val="4DED51FA"/>
     <w:multiLevelType w:val="multilevel"/>
     <w:tmpl w:val="4F76C90C"/>
@@ -4246,7 +3512,7 @@
       </w:rPr>
     </w:lvl>
   </w:abstractNum>
-  <w:abstractNum w:abstractNumId="6">
+  <w:abstractNum w:abstractNumId="6" w15:restartNumberingAfterBreak="0">
     <w:nsid w:val="54C9754F"/>
     <w:multiLevelType w:val="multilevel"/>
     <w:tmpl w:val="43C08800"/>
@@ -4386,7 +3652,7 @@
       </w:rPr>
     </w:lvl>
   </w:abstractNum>
-  <w:abstractNum w:abstractNumId="7">
+  <w:abstractNum w:abstractNumId="7" w15:restartNumberingAfterBreak="0">
     <w:nsid w:val="58CE2EDE"/>
     <w:multiLevelType w:val="multilevel"/>
     <w:tmpl w:val="8C5ADEE0"/>
@@ -4526,7 +3792,7 @@
       </w:rPr>
     </w:lvl>
   </w:abstractNum>
-  <w:abstractNum w:abstractNumId="8">
+  <w:abstractNum w:abstractNumId="8" w15:restartNumberingAfterBreak="0">
     <w:nsid w:val="5F8C54D1"/>
     <w:multiLevelType w:val="multilevel"/>
     <w:tmpl w:val="481E3916"/>
@@ -4621,7 +3887,7 @@
       </w:pPr>
     </w:lvl>
   </w:abstractNum>
-  <w:abstractNum w:abstractNumId="9">
+  <w:abstractNum w:abstractNumId="9" w15:restartNumberingAfterBreak="0">
     <w:nsid w:val="6EB85E17"/>
     <w:multiLevelType w:val="multilevel"/>
     <w:tmpl w:val="A0CE7C4E"/>
@@ -4743,7 +4009,7 @@
       </w:pPr>
     </w:lvl>
   </w:abstractNum>
-  <w:abstractNum w:abstractNumId="10">
+  <w:abstractNum w:abstractNumId="10" w15:restartNumberingAfterBreak="0">
     <w:nsid w:val="7A9875C4"/>
     <w:multiLevelType w:val="multilevel"/>
     <w:tmpl w:val="72E2BBB4"/>
@@ -4883,44 +4149,44 @@
       </w:rPr>
     </w:lvl>
   </w:abstractNum>
-  <w:num w:numId="1">
+  <w:num w:numId="1" w16cid:durableId="276563591">
     <w:abstractNumId w:val="8"/>
   </w:num>
-  <w:num w:numId="2">
+  <w:num w:numId="2" w16cid:durableId="57480784">
     <w:abstractNumId w:val="2"/>
   </w:num>
-  <w:num w:numId="3">
+  <w:num w:numId="3" w16cid:durableId="40323670">
     <w:abstractNumId w:val="6"/>
   </w:num>
-  <w:num w:numId="4">
+  <w:num w:numId="4" w16cid:durableId="1849099970">
     <w:abstractNumId w:val="10"/>
   </w:num>
-  <w:num w:numId="5">
+  <w:num w:numId="5" w16cid:durableId="683560238">
     <w:abstractNumId w:val="5"/>
   </w:num>
-  <w:num w:numId="6">
+  <w:num w:numId="6" w16cid:durableId="1245994065">
     <w:abstractNumId w:val="3"/>
   </w:num>
-  <w:num w:numId="7">
+  <w:num w:numId="7" w16cid:durableId="1171483920">
     <w:abstractNumId w:val="1"/>
   </w:num>
-  <w:num w:numId="8">
+  <w:num w:numId="8" w16cid:durableId="263000445">
     <w:abstractNumId w:val="0"/>
   </w:num>
-  <w:num w:numId="9">
+  <w:num w:numId="9" w16cid:durableId="1966423169">
     <w:abstractNumId w:val="4"/>
   </w:num>
-  <w:num w:numId="10">
+  <w:num w:numId="10" w16cid:durableId="580674546">
     <w:abstractNumId w:val="7"/>
   </w:num>
-  <w:num w:numId="11">
+  <w:num w:numId="11" w16cid:durableId="1993488572">
     <w:abstractNumId w:val="9"/>
   </w:num>
 </w:numbering>
 </file>
 
 <file path=word/styles.xml><?xml version="1.0" encoding="utf-8"?>
-<w:styles xmlns:mc="http://schemas.openxmlformats.org/markup-compatibility/2006" xmlns:r="http://schemas.openxmlformats.org/officeDocument/2006/relationships" xmlns:w="http://schemas.openxmlformats.org/wordprocessingml/2006/main" xmlns:w14="http://schemas.microsoft.com/office/word/2010/wordml" xmlns:w15="http://schemas.microsoft.com/office/word/2012/wordml" mc:Ignorable="w14 w15">
+<w:styles xmlns:mc="http://schemas.openxmlformats.org/markup-compatibility/2006" xmlns:r="http://schemas.openxmlformats.org/officeDocument/2006/relationships" xmlns:w="http://schemas.openxmlformats.org/wordprocessingml/2006/main" xmlns:w14="http://schemas.microsoft.com/office/word/2010/wordml" xmlns:w15="http://schemas.microsoft.com/office/word/2012/wordml" xmlns:w16cex="http://schemas.microsoft.com/office/word/2018/wordml/cex" xmlns:w16cid="http://schemas.microsoft.com/office/word/2016/wordml/cid" xmlns:w16="http://schemas.microsoft.com/office/word/2018/wordml" xmlns:w16du="http://schemas.microsoft.com/office/word/2023/wordml/word16du" xmlns:w16sdtdh="http://schemas.microsoft.com/office/word/2020/wordml/sdtdatahash" xmlns:w16sdtfl="http://schemas.microsoft.com/office/word/2024/wordml/sdtformatlock" xmlns:w16se="http://schemas.microsoft.com/office/word/2015/wordml/symex" mc:Ignorable="w14 w15 w16se w16cid w16 w16cex w16sdtdh w16sdtfl w16du">
   <w:docDefaults>
     <w:rPrDefault>
       <w:rPr>
@@ -4930,7 +4196,7 @@
     </w:rPrDefault>
     <w:pPrDefault/>
   </w:docDefaults>
-  <w:latentStyles w:defLockedState="0" w:defUIPriority="99" w:defSemiHidden="0" w:defUnhideWhenUsed="0" w:defQFormat="0" w:count="380">
+  <w:latentStyles w:defLockedState="0" w:defUIPriority="99" w:defSemiHidden="0" w:defUnhideWhenUsed="0" w:defQFormat="0" w:count="376">
     <w:lsdException w:name="Normal" w:uiPriority="0"/>
     <w:lsdException w:name="heading 2" w:semiHidden="1" w:unhideWhenUsed="1"/>
     <w:lsdException w:name="heading 3" w:semiHidden="1" w:unhideWhenUsed="1"/>
@@ -5297,6 +4563,7 @@
   </w:latentStyles>
   <w:style w:type="paragraph" w:default="1" w:styleId="Normal">
     <w:name w:val="Normal"/>
+    <w:rsid w:val="009B5E9C"/>
     <w:pPr>
       <w:widowControl w:val="0"/>
       <w:suppressAutoHyphens/>
@@ -5331,7 +4598,6 @@
   <w:style w:type="character" w:default="1" w:styleId="DefaultParagraphFont">
     <w:name w:val="Default Paragraph Font"/>
     <w:uiPriority w:val="1"/>
-    <w:semiHidden/>
     <w:unhideWhenUsed/>
   </w:style>
   <w:style w:type="table" w:default="1" w:styleId="TableNormal">

</xml_diff>